<commit_message>
docs: normalize thesis source formatting
</commit_message>
<xml_diff>
--- a/docs/AI_Agent_Marketing_Command_Center_Thesis_Design_2026.docx
+++ b/docs/AI_Agent_Marketing_Command_Center_Thesis_Design_2026.docx
@@ -336,8 +336,14 @@
         <w:t xml:space="preserve">Phiên bản:</w:t>
       </w:r>
       <w:r>
-        <w:t xml:space="preserve"> 1.0 - 15/07/2026 </w:t>
-      </w:r>
+        <w:t xml:space="preserve"> 1.0 - 15/07/2026</w:t>
+      </w:r>
+    </w:p>
+    <w:p>
+      <w:pPr>
+        <w:spacing w:after="130" w:line="330"/>
+        <w:jc w:val="both"/>
+      </w:pPr>
       <w:r>
         <w:rPr>
           <w:b/>
@@ -346,8 +352,14 @@
         <w:t xml:space="preserve">Đề tài:</w:t>
       </w:r>
       <w:r>
-        <w:t xml:space="preserve"> Xây dựng hệ thống đa tác nhân AI hỗ trợ vận hành phòng Marketing doanh nghiệp qua Telegram </w:t>
-      </w:r>
+        <w:t xml:space="preserve"> Xây dựng hệ thống đa tác nhân AI hỗ trợ vận hành phòng Marketing doanh nghiệp qua Telegram</w:t>
+      </w:r>
+    </w:p>
+    <w:p>
+      <w:pPr>
+        <w:spacing w:after="130" w:line="330"/>
+        <w:jc w:val="both"/>
+      </w:pPr>
       <w:r>
         <w:rPr>
           <w:b/>
@@ -356,8 +368,14 @@
         <w:t xml:space="preserve">Phạm vi hiện hành:</w:t>
       </w:r>
       <w:r>
-        <w:t xml:space="preserve"> Telegram-first, Dashboard realtime, 9Router/LLM, Meta Graph API, Human-in-the-loop </w:t>
-      </w:r>
+        <w:t xml:space="preserve"> Telegram-first, Dashboard realtime, 9Router/LLM, Meta Graph API, Human-in-the-loop</w:t>
+      </w:r>
+    </w:p>
+    <w:p>
+      <w:pPr>
+        <w:spacing w:after="130" w:line="330"/>
+        <w:jc w:val="both"/>
+      </w:pPr>
       <w:r>
         <w:rPr>
           <w:b/>
@@ -375,9 +393,12 @@
         </w:rPr>
         <w:t xml:space="preserve">Harry-Kien/AI_Agent_marketing</w:t>
       </w:r>
-      <w:r>
-        <w:t xml:space="preserve"> </w:t>
-      </w:r>
+    </w:p>
+    <w:p>
+      <w:pPr>
+        <w:spacing w:after="130" w:line="330"/>
+        <w:jc w:val="both"/>
+      </w:pPr>
       <w:r>
         <w:rPr>
           <w:b/>
@@ -12435,8 +12456,12 @@
     </w:p>
     <w:p>
       <w:pPr>
-        <w:spacing w:after="130" w:line="330"/>
-        <w:jc w:val="both"/>
+        <w:pStyle w:val="ListParagraph"/>
+        <w:numPr>
+          <w:ilvl w:val="0"/>
+          <w:numId w:val="3"/>
+        </w:numPr>
+        <w:spacing w:after="80" w:line="300"/>
       </w:pPr>
       <w:r>
         <w:rPr>
@@ -12446,8 +12471,18 @@
         <w:t xml:space="preserve">Giai đoạn 1 - Bền vững hóa:</w:t>
       </w:r>
       <w:r>
-        <w:t xml:space="preserve"> PostgreSQL, migration, transaction, queue, idempotency key và backup. </w:t>
-      </w:r>
+        <w:t xml:space="preserve"> PostgreSQL, migration, transaction, queue, idempotency key và backup.</w:t>
+      </w:r>
+    </w:p>
+    <w:p>
+      <w:pPr>
+        <w:pStyle w:val="ListParagraph"/>
+        <w:numPr>
+          <w:ilvl w:val="0"/>
+          <w:numId w:val="3"/>
+        </w:numPr>
+        <w:spacing w:after="80" w:line="300"/>
+      </w:pPr>
       <w:r>
         <w:rPr>
           <w:b/>
@@ -12456,8 +12491,18 @@
         <w:t xml:space="preserve">Giai đoạn 2 - Triển khai cloud:</w:t>
       </w:r>
       <w:r>
-        <w:t xml:space="preserve"> HTTPS webhook, secret manager, process supervisor, CI/CD và staging. </w:t>
-      </w:r>
+        <w:t xml:space="preserve"> HTTPS webhook, secret manager, process supervisor, CI/CD và staging.</w:t>
+      </w:r>
+    </w:p>
+    <w:p>
+      <w:pPr>
+        <w:pStyle w:val="ListParagraph"/>
+        <w:numPr>
+          <w:ilvl w:val="0"/>
+          <w:numId w:val="3"/>
+        </w:numPr>
+        <w:spacing w:after="80" w:line="300"/>
+      </w:pPr>
       <w:r>
         <w:rPr>
           <w:b/>
@@ -12466,8 +12511,18 @@
         <w:t xml:space="preserve">Giai đoạn 3 - Quan sát:</w:t>
       </w:r>
       <w:r>
-        <w:t xml:space="preserve"> OpenTelemetry, Sentry, dashboard latency/cost/token và alert. </w:t>
-      </w:r>
+        <w:t xml:space="preserve"> OpenTelemetry, Sentry, dashboard latency/cost/token và alert.</w:t>
+      </w:r>
+    </w:p>
+    <w:p>
+      <w:pPr>
+        <w:pStyle w:val="ListParagraph"/>
+        <w:numPr>
+          <w:ilvl w:val="0"/>
+          <w:numId w:val="3"/>
+        </w:numPr>
+        <w:spacing w:after="80" w:line="300"/>
+      </w:pPr>
       <w:r>
         <w:rPr>
           <w:b/>
@@ -12476,8 +12531,18 @@
         <w:t xml:space="preserve">Giai đoạn 4 - Tri thức doanh nghiệp:</w:t>
       </w:r>
       <w:r>
-        <w:t xml:space="preserve"> brand guideline, product catalog, FAQ, vector search và versioned knowledge base. </w:t>
-      </w:r>
+        <w:t xml:space="preserve"> brand guideline, product catalog, FAQ, vector search và versioned knowledge base.</w:t>
+      </w:r>
+    </w:p>
+    <w:p>
+      <w:pPr>
+        <w:pStyle w:val="ListParagraph"/>
+        <w:numPr>
+          <w:ilvl w:val="0"/>
+          <w:numId w:val="3"/>
+        </w:numPr>
+        <w:spacing w:after="80" w:line="300"/>
+      </w:pPr>
       <w:r>
         <w:rPr>
           <w:b/>
@@ -12486,8 +12551,18 @@
         <w:t xml:space="preserve">Giai đoạn 5 - Tối ưu Marketing:</w:t>
       </w:r>
       <w:r>
-        <w:t xml:space="preserve"> lịch nội dung, A/B testing, metrics ingestion, attribution và đề xuất cải tiến. </w:t>
-      </w:r>
+        <w:t xml:space="preserve"> lịch nội dung, A/B testing, metrics ingestion, attribution và đề xuất cải tiến.</w:t>
+      </w:r>
+    </w:p>
+    <w:p>
+      <w:pPr>
+        <w:pStyle w:val="ListParagraph"/>
+        <w:numPr>
+          <w:ilvl w:val="0"/>
+          <w:numId w:val="3"/>
+        </w:numPr>
+        <w:spacing w:after="80" w:line="300"/>
+      </w:pPr>
       <w:r>
         <w:rPr>
           <w:b/>

</xml_diff>

<commit_message>
fix: streamline final Facebook publication approval
</commit_message>
<xml_diff>
--- a/docs/AI_Agent_Marketing_Command_Center_Thesis_Design_2026.docx
+++ b/docs/AI_Agent_Marketing_Command_Center_Thesis_Design_2026.docx
@@ -2768,18 +2768,7 @@
                 <w:sz w:val="18"/>
                 <w:szCs w:val="18"/>
               </w:rPr>
-              <w:t xml:space="preserve">Operator xem Final → gửi “Duyệt” → workflow chuyển </w:t>
-            </w:r>
-            <w:r>
-              <w:rPr>
-                <w:rFonts w:ascii="Consolas" w:cs="Consolas" w:eastAsia="Consolas" w:hAnsi="Consolas"/>
-                <w:b w:val="false"/>
-                <w:bCs w:val="false"/>
-                <w:color w:val="18313F"/>
-                <w:sz w:val="18"/>
-                <w:szCs w:val="18"/>
-              </w:rPr>
-              <w:t xml:space="preserve">ready_to_schedule</w:t>
+              <w:t xml:space="preserve">Operator xem Final → gửi “Duyệt” → workflow tự tạo publication preview</w:t>
             </w:r>
           </w:p>
         </w:tc>
@@ -5580,7 +5569,7 @@
       <w:r>
         <w:drawing>
           <wp:inline distT="0" distB="0" distL="0" distR="0">
-            <wp:extent cx="6191250" cy="4000500"/>
+            <wp:extent cx="6191250" cy="3876675"/>
             <wp:effectExtent t="0" r="0" b="0" l="0"/>
             <wp:docPr id="1" name="Hình 5. Sơ đồ hệ thống" descr="Hình 5. Sơ đồ hệ thống" title="Hình 5. Sơ đồ hệ thống"/>
             <wp:cNvGraphicFramePr>
@@ -5605,7 +5594,7 @@
                   <pic:spPr bwMode="auto">
                     <a:xfrm>
                       <a:off x="0" y="0"/>
-                      <a:ext cx="6191250" cy="4000500"/>
+                      <a:ext cx="6191250" cy="3876675"/>
                     </a:xfrm>
                     <a:prstGeom prst="rect">
                       <a:avLst/>
@@ -5722,7 +5711,7 @@
       <w:r>
         <w:drawing>
           <wp:inline distT="0" distB="0" distL="0" distR="0">
-            <wp:extent cx="6191250" cy="5781675"/>
+            <wp:extent cx="6191250" cy="5667375"/>
             <wp:effectExtent t="0" r="0" b="0" l="0"/>
             <wp:docPr id="1" name="Hình 7. Sơ đồ hệ thống" descr="Hình 7. Sơ đồ hệ thống" title="Hình 7. Sơ đồ hệ thống"/>
             <wp:cNvGraphicFramePr>
@@ -5747,7 +5736,7 @@
                   <pic:spPr bwMode="auto">
                     <a:xfrm>
                       <a:off x="0" y="0"/>
-                      <a:ext cx="6191250" cy="5781675"/>
+                      <a:ext cx="6191250" cy="5667375"/>
                     </a:xfrm>
                     <a:prstGeom prst="rect">
                       <a:avLst/>
@@ -10900,20 +10889,7 @@
         <w:spacing w:after="80" w:line="300"/>
       </w:pPr>
       <w:r>
-        <w:t xml:space="preserve">Operator nhắn “Lên lịch chiến dịch này”.</w:t>
-      </w:r>
-    </w:p>
-    <w:p>
-      <w:pPr>
-        <w:pStyle w:val="ListParagraph"/>
-        <w:numPr>
-          <w:ilvl w:val="0"/>
-          <w:numId w:val="2"/>
-        </w:numPr>
-        <w:spacing w:after="80" w:line="300"/>
-      </w:pPr>
-      <w:r>
-        <w:t xml:space="preserve">Page Growth hiển thị exact preview.</w:t>
+        <w:t xml:space="preserve">Page Growth tự hiển thị exact preview ngay sau khi Final được duyệt.</w:t>
       </w:r>
     </w:p>
     <w:p>

</xml_diff>

<commit_message>
docs(thesis): sync design doc and diagrams with capability modules
Reflect the five capability modules (F02/F03/F06/F10/F11) in the
thesis source: component architecture, DFD level 1, entity table and
ERD now include competitor/insight/media/metric/learning/community.
Update test results to 21 files / 126 tests and regenerate diagrams
and the thesis docx.

Co-Authored-By: Claude Opus 4.8 <noreply@anthropic.com>
</commit_message>
<xml_diff>
--- a/docs/AI_Agent_Marketing_Command_Center_Thesis_Design_2026.docx
+++ b/docs/AI_Agent_Marketing_Command_Center_Thesis_Design_2026.docx
@@ -5426,7 +5426,7 @@
       <w:r>
         <w:drawing>
           <wp:inline distT="0" distB="0" distL="0" distR="0">
-            <wp:extent cx="6191250" cy="4762500"/>
+            <wp:extent cx="6191250" cy="5895975"/>
             <wp:effectExtent t="0" r="0" b="0" l="0"/>
             <wp:docPr id="1" name="Hình 3. Sơ đồ hệ thống" descr="Hình 3. Sơ đồ hệ thống" title="Hình 3. Sơ đồ hệ thống"/>
             <wp:cNvGraphicFramePr>
@@ -5451,7 +5451,7 @@
                   <pic:spPr bwMode="auto">
                     <a:xfrm>
                       <a:off x="0" y="0"/>
-                      <a:ext cx="6191250" cy="4762500"/>
+                      <a:ext cx="6191250" cy="5895975"/>
                     </a:xfrm>
                     <a:prstGeom prst="rect">
                       <a:avLst/>
@@ -5479,6 +5479,910 @@
         </w:rPr>
         <w:t xml:space="preserve">Hình 3. Sơ đồ hệ thống</w:t>
       </w:r>
+    </w:p>
+    <w:p>
+      <w:pPr>
+        <w:pStyle w:val="Heading2"/>
+        <w:keepNext/>
+      </w:pPr>
+      <w:r>
+        <w:t xml:space="preserve">9.1. Module năng lực chuyên biệt và read model</w:t>
+      </w:r>
+    </w:p>
+    <w:p>
+      <w:pPr>
+        <w:spacing w:after="130" w:line="330"/>
+        <w:jc w:val="both"/>
+      </w:pPr>
+      <w:r>
+        <w:t xml:space="preserve">Ngoài lõi workflow, hệ thống có năm module năng lực thuần hàm, mỗi module có domain type (Zod), logic xác định (deterministic) và một read model đã redacted phơi qua Control API:</w:t>
+      </w:r>
+    </w:p>
+    <w:tbl>
+      <w:tblPr>
+        <w:tblW w:type="dxa" w:w="9026"/>
+        <w:tblBorders>
+          <w:top w:val="single" w:color="auto" w:sz="4"/>
+          <w:left w:val="single" w:color="auto" w:sz="4"/>
+          <w:bottom w:val="single" w:color="auto" w:sz="4"/>
+          <w:right w:val="single" w:color="auto" w:sz="4"/>
+          <w:insideH w:val="single" w:color="auto" w:sz="4"/>
+          <w:insideV w:val="single" w:color="auto" w:sz="4"/>
+        </w:tblBorders>
+      </w:tblPr>
+      <w:tblGrid>
+        <w:gridCol w:w="2256"/>
+        <w:gridCol w:w="2256"/>
+        <w:gridCol w:w="2256"/>
+        <w:gridCol w:w="2258"/>
+      </w:tblGrid>
+      <w:tr>
+        <w:trPr>
+          <w:cantSplit/>
+        </w:trPr>
+        <w:tc>
+          <w:tcPr>
+            <w:tcW w:type="dxa" w:w="2256"/>
+            <w:tcBorders>
+              <w:top w:val="single" w:color="C8D5DD" w:sz="4"/>
+              <w:left w:val="single" w:color="C8D5DD" w:sz="4"/>
+              <w:bottom w:val="single" w:color="C8D5DD" w:sz="4"/>
+              <w:right w:val="single" w:color="C8D5DD" w:sz="4"/>
+            </w:tcBorders>
+            <w:shd w:fill="1F5D7A" w:val="clear"/>
+            <w:tcMar>
+              <w:top w:type="dxa" w:w="85"/>
+              <w:left w:type="dxa" w:w="100"/>
+              <w:bottom w:type="dxa" w:w="85"/>
+              <w:right w:type="dxa" w:w="100"/>
+            </w:tcMar>
+            <w:vAlign w:val="center"/>
+          </w:tcPr>
+          <w:p>
+            <w:pPr>
+              <w:spacing w:after="0" w:line="250"/>
+            </w:pPr>
+            <w:r>
+              <w:rPr>
+                <w:b/>
+                <w:bCs/>
+                <w:color w:val="FFFFFF"/>
+                <w:sz w:val="18"/>
+                <w:szCs w:val="18"/>
+              </w:rPr>
+              <w:t xml:space="preserve">Module</w:t>
+            </w:r>
+          </w:p>
+        </w:tc>
+        <w:tc>
+          <w:tcPr>
+            <w:tcW w:type="dxa" w:w="2256"/>
+            <w:tcBorders>
+              <w:top w:val="single" w:color="C8D5DD" w:sz="4"/>
+              <w:left w:val="single" w:color="C8D5DD" w:sz="4"/>
+              <w:bottom w:val="single" w:color="C8D5DD" w:sz="4"/>
+              <w:right w:val="single" w:color="C8D5DD" w:sz="4"/>
+            </w:tcBorders>
+            <w:shd w:fill="1F5D7A" w:val="clear"/>
+            <w:tcMar>
+              <w:top w:type="dxa" w:w="85"/>
+              <w:left w:type="dxa" w:w="100"/>
+              <w:bottom w:type="dxa" w:w="85"/>
+              <w:right w:type="dxa" w:w="100"/>
+            </w:tcMar>
+            <w:vAlign w:val="center"/>
+          </w:tcPr>
+          <w:p>
+            <w:pPr>
+              <w:spacing w:after="0" w:line="250"/>
+            </w:pPr>
+            <w:r>
+              <w:rPr>
+                <w:b/>
+                <w:bCs/>
+                <w:color w:val="FFFFFF"/>
+                <w:sz w:val="18"/>
+                <w:szCs w:val="18"/>
+              </w:rPr>
+              <w:t xml:space="preserve">Chức năng</w:t>
+            </w:r>
+          </w:p>
+        </w:tc>
+        <w:tc>
+          <w:tcPr>
+            <w:tcW w:type="dxa" w:w="2256"/>
+            <w:tcBorders>
+              <w:top w:val="single" w:color="C8D5DD" w:sz="4"/>
+              <w:left w:val="single" w:color="C8D5DD" w:sz="4"/>
+              <w:bottom w:val="single" w:color="C8D5DD" w:sz="4"/>
+              <w:right w:val="single" w:color="C8D5DD" w:sz="4"/>
+            </w:tcBorders>
+            <w:shd w:fill="1F5D7A" w:val="clear"/>
+            <w:tcMar>
+              <w:top w:type="dxa" w:w="85"/>
+              <w:left w:type="dxa" w:w="100"/>
+              <w:bottom w:type="dxa" w:w="85"/>
+              <w:right w:type="dxa" w:w="100"/>
+            </w:tcMar>
+            <w:vAlign w:val="center"/>
+          </w:tcPr>
+          <w:p>
+            <w:pPr>
+              <w:spacing w:after="0" w:line="250"/>
+            </w:pPr>
+            <w:r>
+              <w:rPr>
+                <w:b/>
+                <w:bCs/>
+                <w:color w:val="FFFFFF"/>
+                <w:sz w:val="18"/>
+                <w:szCs w:val="18"/>
+              </w:rPr>
+              <w:t xml:space="preserve">Domain type</w:t>
+            </w:r>
+          </w:p>
+        </w:tc>
+        <w:tc>
+          <w:tcPr>
+            <w:tcW w:type="dxa" w:w="2258"/>
+            <w:tcBorders>
+              <w:top w:val="single" w:color="C8D5DD" w:sz="4"/>
+              <w:left w:val="single" w:color="C8D5DD" w:sz="4"/>
+              <w:bottom w:val="single" w:color="C8D5DD" w:sz="4"/>
+              <w:right w:val="single" w:color="C8D5DD" w:sz="4"/>
+            </w:tcBorders>
+            <w:shd w:fill="1F5D7A" w:val="clear"/>
+            <w:tcMar>
+              <w:top w:type="dxa" w:w="85"/>
+              <w:left w:type="dxa" w:w="100"/>
+              <w:bottom w:type="dxa" w:w="85"/>
+              <w:right w:type="dxa" w:w="100"/>
+            </w:tcMar>
+            <w:vAlign w:val="center"/>
+          </w:tcPr>
+          <w:p>
+            <w:pPr>
+              <w:spacing w:after="0" w:line="250"/>
+            </w:pPr>
+            <w:r>
+              <w:rPr>
+                <w:b/>
+                <w:bCs/>
+                <w:color w:val="FFFFFF"/>
+                <w:sz w:val="18"/>
+                <w:szCs w:val="18"/>
+              </w:rPr>
+              <w:t xml:space="preserve">Endpoint read-only</w:t>
+            </w:r>
+          </w:p>
+        </w:tc>
+      </w:tr>
+      <w:tr>
+        <w:trPr>
+          <w:cantSplit/>
+        </w:trPr>
+        <w:tc>
+          <w:tcPr>
+            <w:tcW w:type="dxa" w:w="2256"/>
+            <w:tcBorders>
+              <w:top w:val="single" w:color="C8D5DD" w:sz="4"/>
+              <w:left w:val="single" w:color="C8D5DD" w:sz="4"/>
+              <w:bottom w:val="single" w:color="C8D5DD" w:sz="4"/>
+              <w:right w:val="single" w:color="C8D5DD" w:sz="4"/>
+            </w:tcBorders>
+            <w:tcMar>
+              <w:top w:type="dxa" w:w="85"/>
+              <w:left w:type="dxa" w:w="100"/>
+              <w:bottom w:type="dxa" w:w="85"/>
+              <w:right w:type="dxa" w:w="100"/>
+            </w:tcMar>
+            <w:vAlign w:val="center"/>
+          </w:tcPr>
+          <w:p>
+            <w:pPr>
+              <w:spacing w:after="0" w:line="250"/>
+            </w:pPr>
+            <w:r>
+              <w:rPr>
+                <w:rFonts w:ascii="Consolas" w:cs="Consolas" w:eastAsia="Consolas" w:hAnsi="Consolas"/>
+                <w:b w:val="false"/>
+                <w:bCs w:val="false"/>
+                <w:color w:val="18313F"/>
+                <w:sz w:val="18"/>
+                <w:szCs w:val="18"/>
+              </w:rPr>
+              <w:t xml:space="preserve">competitorMonitor.ts</w:t>
+            </w:r>
+          </w:p>
+        </w:tc>
+        <w:tc>
+          <w:tcPr>
+            <w:tcW w:type="dxa" w:w="2256"/>
+            <w:tcBorders>
+              <w:top w:val="single" w:color="C8D5DD" w:sz="4"/>
+              <w:left w:val="single" w:color="C8D5DD" w:sz="4"/>
+              <w:bottom w:val="single" w:color="C8D5DD" w:sz="4"/>
+              <w:right w:val="single" w:color="C8D5DD" w:sz="4"/>
+            </w:tcBorders>
+            <w:tcMar>
+              <w:top w:type="dxa" w:w="85"/>
+              <w:left w:type="dxa" w:w="100"/>
+              <w:bottom w:type="dxa" w:w="85"/>
+              <w:right w:type="dxa" w:w="100"/>
+            </w:tcMar>
+            <w:vAlign w:val="center"/>
+          </w:tcPr>
+          <w:p>
+            <w:pPr>
+              <w:spacing w:after="0" w:line="250"/>
+            </w:pPr>
+            <w:r>
+              <w:rPr>
+                <w:b w:val="false"/>
+                <w:bCs w:val="false"/>
+                <w:color w:val="18313F"/>
+                <w:sz w:val="18"/>
+                <w:szCs w:val="18"/>
+              </w:rPr>
+              <w:t xml:space="preserve">Diff hai snapshot đối thủ, khử trùng bằng </w:t>
+            </w:r>
+            <w:r>
+              <w:rPr>
+                <w:rFonts w:ascii="Consolas" w:cs="Consolas" w:eastAsia="Consolas" w:hAnsi="Consolas"/>
+                <w:b w:val="false"/>
+                <w:bCs w:val="false"/>
+                <w:color w:val="18313F"/>
+                <w:sz w:val="18"/>
+                <w:szCs w:val="18"/>
+              </w:rPr>
+              <w:t xml:space="preserve">dedupKey</w:t>
+            </w:r>
+            <w:r>
+              <w:rPr>
+                <w:b w:val="false"/>
+                <w:bCs w:val="false"/>
+                <w:color w:val="18313F"/>
+                <w:sz w:val="18"/>
+                <w:szCs w:val="18"/>
+              </w:rPr>
+              <w:t xml:space="preserve"> (F03)</w:t>
+            </w:r>
+          </w:p>
+        </w:tc>
+        <w:tc>
+          <w:tcPr>
+            <w:tcW w:type="dxa" w:w="2256"/>
+            <w:tcBorders>
+              <w:top w:val="single" w:color="C8D5DD" w:sz="4"/>
+              <w:left w:val="single" w:color="C8D5DD" w:sz="4"/>
+              <w:bottom w:val="single" w:color="C8D5DD" w:sz="4"/>
+              <w:right w:val="single" w:color="C8D5DD" w:sz="4"/>
+            </w:tcBorders>
+            <w:tcMar>
+              <w:top w:type="dxa" w:w="85"/>
+              <w:left w:type="dxa" w:w="100"/>
+              <w:bottom w:type="dxa" w:w="85"/>
+              <w:right w:type="dxa" w:w="100"/>
+            </w:tcMar>
+            <w:vAlign w:val="center"/>
+          </w:tcPr>
+          <w:p>
+            <w:pPr>
+              <w:spacing w:after="0" w:line="250"/>
+            </w:pPr>
+            <w:r>
+              <w:rPr>
+                <w:rFonts w:ascii="Consolas" w:cs="Consolas" w:eastAsia="Consolas" w:hAnsi="Consolas"/>
+                <w:b w:val="false"/>
+                <w:bCs w:val="false"/>
+                <w:color w:val="18313F"/>
+                <w:sz w:val="18"/>
+                <w:szCs w:val="18"/>
+              </w:rPr>
+              <w:t xml:space="preserve">competitorTypes.ts</w:t>
+            </w:r>
+          </w:p>
+        </w:tc>
+        <w:tc>
+          <w:tcPr>
+            <w:tcW w:type="dxa" w:w="2258"/>
+            <w:tcBorders>
+              <w:top w:val="single" w:color="C8D5DD" w:sz="4"/>
+              <w:left w:val="single" w:color="C8D5DD" w:sz="4"/>
+              <w:bottom w:val="single" w:color="C8D5DD" w:sz="4"/>
+              <w:right w:val="single" w:color="C8D5DD" w:sz="4"/>
+            </w:tcBorders>
+            <w:tcMar>
+              <w:top w:type="dxa" w:w="85"/>
+              <w:left w:type="dxa" w:w="100"/>
+              <w:bottom w:type="dxa" w:w="85"/>
+              <w:right w:type="dxa" w:w="100"/>
+            </w:tcMar>
+            <w:vAlign w:val="center"/>
+          </w:tcPr>
+          <w:p>
+            <w:pPr>
+              <w:spacing w:after="0" w:line="250"/>
+            </w:pPr>
+            <w:r>
+              <w:rPr>
+                <w:rFonts w:ascii="Consolas" w:cs="Consolas" w:eastAsia="Consolas" w:hAnsi="Consolas"/>
+                <w:b w:val="false"/>
+                <w:bCs w:val="false"/>
+                <w:color w:val="18313F"/>
+                <w:sz w:val="18"/>
+                <w:szCs w:val="18"/>
+              </w:rPr>
+              <w:t xml:space="preserve">GET /api/competitors</w:t>
+            </w:r>
+          </w:p>
+        </w:tc>
+      </w:tr>
+      <w:tr>
+        <w:trPr>
+          <w:cantSplit/>
+        </w:trPr>
+        <w:tc>
+          <w:tcPr>
+            <w:tcW w:type="dxa" w:w="2256"/>
+            <w:tcBorders>
+              <w:top w:val="single" w:color="C8D5DD" w:sz="4"/>
+              <w:left w:val="single" w:color="C8D5DD" w:sz="4"/>
+              <w:bottom w:val="single" w:color="C8D5DD" w:sz="4"/>
+              <w:right w:val="single" w:color="C8D5DD" w:sz="4"/>
+            </w:tcBorders>
+            <w:tcMar>
+              <w:top w:type="dxa" w:w="85"/>
+              <w:left w:type="dxa" w:w="100"/>
+              <w:bottom w:type="dxa" w:w="85"/>
+              <w:right w:type="dxa" w:w="100"/>
+            </w:tcMar>
+            <w:vAlign w:val="center"/>
+          </w:tcPr>
+          <w:p>
+            <w:pPr>
+              <w:spacing w:after="0" w:line="250"/>
+            </w:pPr>
+            <w:r>
+              <w:rPr>
+                <w:rFonts w:ascii="Consolas" w:cs="Consolas" w:eastAsia="Consolas" w:hAnsi="Consolas"/>
+                <w:b w:val="false"/>
+                <w:bCs w:val="false"/>
+                <w:color w:val="18313F"/>
+                <w:sz w:val="18"/>
+                <w:szCs w:val="18"/>
+              </w:rPr>
+              <w:t xml:space="preserve">marketResearch.ts</w:t>
+            </w:r>
+          </w:p>
+        </w:tc>
+        <w:tc>
+          <w:tcPr>
+            <w:tcW w:type="dxa" w:w="2256"/>
+            <w:tcBorders>
+              <w:top w:val="single" w:color="C8D5DD" w:sz="4"/>
+              <w:left w:val="single" w:color="C8D5DD" w:sz="4"/>
+              <w:bottom w:val="single" w:color="C8D5DD" w:sz="4"/>
+              <w:right w:val="single" w:color="C8D5DD" w:sz="4"/>
+            </w:tcBorders>
+            <w:tcMar>
+              <w:top w:type="dxa" w:w="85"/>
+              <w:left w:type="dxa" w:w="100"/>
+              <w:bottom w:type="dxa" w:w="85"/>
+              <w:right w:type="dxa" w:w="100"/>
+            </w:tcMar>
+            <w:vAlign w:val="center"/>
+          </w:tcPr>
+          <w:p>
+            <w:pPr>
+              <w:spacing w:after="0" w:line="250"/>
+            </w:pPr>
+            <w:r>
+              <w:rPr>
+                <w:b w:val="false"/>
+                <w:bCs w:val="false"/>
+                <w:color w:val="18313F"/>
+                <w:sz w:val="18"/>
+                <w:szCs w:val="18"/>
+              </w:rPr>
+              <w:t xml:space="preserve">Tổng hợp insight có nguồn/bằng chứng/độ tin cậy (F02)</w:t>
+            </w:r>
+          </w:p>
+        </w:tc>
+        <w:tc>
+          <w:tcPr>
+            <w:tcW w:type="dxa" w:w="2256"/>
+            <w:tcBorders>
+              <w:top w:val="single" w:color="C8D5DD" w:sz="4"/>
+              <w:left w:val="single" w:color="C8D5DD" w:sz="4"/>
+              <w:bottom w:val="single" w:color="C8D5DD" w:sz="4"/>
+              <w:right w:val="single" w:color="C8D5DD" w:sz="4"/>
+            </w:tcBorders>
+            <w:tcMar>
+              <w:top w:type="dxa" w:w="85"/>
+              <w:left w:type="dxa" w:w="100"/>
+              <w:bottom w:type="dxa" w:w="85"/>
+              <w:right w:type="dxa" w:w="100"/>
+            </w:tcMar>
+            <w:vAlign w:val="center"/>
+          </w:tcPr>
+          <w:p>
+            <w:pPr>
+              <w:spacing w:after="0" w:line="250"/>
+            </w:pPr>
+            <w:r>
+              <w:rPr>
+                <w:rFonts w:ascii="Consolas" w:cs="Consolas" w:eastAsia="Consolas" w:hAnsi="Consolas"/>
+                <w:b w:val="false"/>
+                <w:bCs w:val="false"/>
+                <w:color w:val="18313F"/>
+                <w:sz w:val="18"/>
+                <w:szCs w:val="18"/>
+              </w:rPr>
+              <w:t xml:space="preserve">marketResearchTypes.ts</w:t>
+            </w:r>
+          </w:p>
+        </w:tc>
+        <w:tc>
+          <w:tcPr>
+            <w:tcW w:type="dxa" w:w="2258"/>
+            <w:tcBorders>
+              <w:top w:val="single" w:color="C8D5DD" w:sz="4"/>
+              <w:left w:val="single" w:color="C8D5DD" w:sz="4"/>
+              <w:bottom w:val="single" w:color="C8D5DD" w:sz="4"/>
+              <w:right w:val="single" w:color="C8D5DD" w:sz="4"/>
+            </w:tcBorders>
+            <w:tcMar>
+              <w:top w:type="dxa" w:w="85"/>
+              <w:left w:type="dxa" w:w="100"/>
+              <w:bottom w:type="dxa" w:w="85"/>
+              <w:right w:type="dxa" w:w="100"/>
+            </w:tcMar>
+            <w:vAlign w:val="center"/>
+          </w:tcPr>
+          <w:p>
+            <w:pPr>
+              <w:spacing w:after="0" w:line="250"/>
+            </w:pPr>
+            <w:r>
+              <w:rPr>
+                <w:rFonts w:ascii="Consolas" w:cs="Consolas" w:eastAsia="Consolas" w:hAnsi="Consolas"/>
+                <w:b w:val="false"/>
+                <w:bCs w:val="false"/>
+                <w:color w:val="18313F"/>
+                <w:sz w:val="18"/>
+                <w:szCs w:val="18"/>
+              </w:rPr>
+              <w:t xml:space="preserve">GET /api/market-research</w:t>
+            </w:r>
+          </w:p>
+        </w:tc>
+      </w:tr>
+      <w:tr>
+        <w:trPr>
+          <w:cantSplit/>
+        </w:trPr>
+        <w:tc>
+          <w:tcPr>
+            <w:tcW w:type="dxa" w:w="2256"/>
+            <w:tcBorders>
+              <w:top w:val="single" w:color="C8D5DD" w:sz="4"/>
+              <w:left w:val="single" w:color="C8D5DD" w:sz="4"/>
+              <w:bottom w:val="single" w:color="C8D5DD" w:sz="4"/>
+              <w:right w:val="single" w:color="C8D5DD" w:sz="4"/>
+            </w:tcBorders>
+            <w:tcMar>
+              <w:top w:type="dxa" w:w="85"/>
+              <w:left w:type="dxa" w:w="100"/>
+              <w:bottom w:type="dxa" w:w="85"/>
+              <w:right w:type="dxa" w:w="100"/>
+            </w:tcMar>
+            <w:vAlign w:val="center"/>
+          </w:tcPr>
+          <w:p>
+            <w:pPr>
+              <w:spacing w:after="0" w:line="250"/>
+            </w:pPr>
+            <w:r>
+              <w:rPr>
+                <w:rFonts w:ascii="Consolas" w:cs="Consolas" w:eastAsia="Consolas" w:hAnsi="Consolas"/>
+                <w:b w:val="false"/>
+                <w:bCs w:val="false"/>
+                <w:color w:val="18313F"/>
+                <w:sz w:val="18"/>
+                <w:szCs w:val="18"/>
+              </w:rPr>
+              <w:t xml:space="preserve">videoGenerationAdapter.ts</w:t>
+            </w:r>
+          </w:p>
+        </w:tc>
+        <w:tc>
+          <w:tcPr>
+            <w:tcW w:type="dxa" w:w="2256"/>
+            <w:tcBorders>
+              <w:top w:val="single" w:color="C8D5DD" w:sz="4"/>
+              <w:left w:val="single" w:color="C8D5DD" w:sz="4"/>
+              <w:bottom w:val="single" w:color="C8D5DD" w:sz="4"/>
+              <w:right w:val="single" w:color="C8D5DD" w:sz="4"/>
+            </w:tcBorders>
+            <w:tcMar>
+              <w:top w:type="dxa" w:w="85"/>
+              <w:left w:type="dxa" w:w="100"/>
+              <w:bottom w:type="dxa" w:w="85"/>
+              <w:right w:type="dxa" w:w="100"/>
+            </w:tcMar>
+            <w:vAlign w:val="center"/>
+          </w:tcPr>
+          <w:p>
+            <w:pPr>
+              <w:spacing w:after="0" w:line="250"/>
+            </w:pPr>
+            <w:r>
+              <w:rPr>
+                <w:b w:val="false"/>
+                <w:bCs w:val="false"/>
+                <w:color w:val="18313F"/>
+                <w:sz w:val="18"/>
+                <w:szCs w:val="18"/>
+              </w:rPr>
+              <w:t xml:space="preserve">Guarded video job, fallback mock có contract tương đương (F06)</w:t>
+            </w:r>
+          </w:p>
+        </w:tc>
+        <w:tc>
+          <w:tcPr>
+            <w:tcW w:type="dxa" w:w="2256"/>
+            <w:tcBorders>
+              <w:top w:val="single" w:color="C8D5DD" w:sz="4"/>
+              <w:left w:val="single" w:color="C8D5DD" w:sz="4"/>
+              <w:bottom w:val="single" w:color="C8D5DD" w:sz="4"/>
+              <w:right w:val="single" w:color="C8D5DD" w:sz="4"/>
+            </w:tcBorders>
+            <w:tcMar>
+              <w:top w:type="dxa" w:w="85"/>
+              <w:left w:type="dxa" w:w="100"/>
+              <w:bottom w:type="dxa" w:w="85"/>
+              <w:right w:type="dxa" w:w="100"/>
+            </w:tcMar>
+            <w:vAlign w:val="center"/>
+          </w:tcPr>
+          <w:p>
+            <w:pPr>
+              <w:spacing w:after="0" w:line="250"/>
+            </w:pPr>
+            <w:r>
+              <w:rPr>
+                <w:rFonts w:ascii="Consolas" w:cs="Consolas" w:eastAsia="Consolas" w:hAnsi="Consolas"/>
+                <w:b w:val="false"/>
+                <w:bCs w:val="false"/>
+                <w:color w:val="18313F"/>
+                <w:sz w:val="18"/>
+                <w:szCs w:val="18"/>
+              </w:rPr>
+              <w:t xml:space="preserve">mediaTypes.ts</w:t>
+            </w:r>
+          </w:p>
+        </w:tc>
+        <w:tc>
+          <w:tcPr>
+            <w:tcW w:type="dxa" w:w="2258"/>
+            <w:tcBorders>
+              <w:top w:val="single" w:color="C8D5DD" w:sz="4"/>
+              <w:left w:val="single" w:color="C8D5DD" w:sz="4"/>
+              <w:bottom w:val="single" w:color="C8D5DD" w:sz="4"/>
+              <w:right w:val="single" w:color="C8D5DD" w:sz="4"/>
+            </w:tcBorders>
+            <w:tcMar>
+              <w:top w:type="dxa" w:w="85"/>
+              <w:left w:type="dxa" w:w="100"/>
+              <w:bottom w:type="dxa" w:w="85"/>
+              <w:right w:type="dxa" w:w="100"/>
+            </w:tcMar>
+            <w:vAlign w:val="center"/>
+          </w:tcPr>
+          <w:p>
+            <w:pPr>
+              <w:spacing w:after="0" w:line="250"/>
+            </w:pPr>
+            <w:r>
+              <w:rPr>
+                <w:rFonts w:ascii="Consolas" w:cs="Consolas" w:eastAsia="Consolas" w:hAnsi="Consolas"/>
+                <w:b w:val="false"/>
+                <w:bCs w:val="false"/>
+                <w:color w:val="18313F"/>
+                <w:sz w:val="18"/>
+                <w:szCs w:val="18"/>
+              </w:rPr>
+              <w:t xml:space="preserve">GET /api/video-studio</w:t>
+            </w:r>
+          </w:p>
+        </w:tc>
+      </w:tr>
+      <w:tr>
+        <w:trPr>
+          <w:cantSplit/>
+        </w:trPr>
+        <w:tc>
+          <w:tcPr>
+            <w:tcW w:type="dxa" w:w="2256"/>
+            <w:tcBorders>
+              <w:top w:val="single" w:color="C8D5DD" w:sz="4"/>
+              <w:left w:val="single" w:color="C8D5DD" w:sz="4"/>
+              <w:bottom w:val="single" w:color="C8D5DD" w:sz="4"/>
+              <w:right w:val="single" w:color="C8D5DD" w:sz="4"/>
+            </w:tcBorders>
+            <w:tcMar>
+              <w:top w:type="dxa" w:w="85"/>
+              <w:left w:type="dxa" w:w="100"/>
+              <w:bottom w:type="dxa" w:w="85"/>
+              <w:right w:type="dxa" w:w="100"/>
+            </w:tcMar>
+            <w:vAlign w:val="center"/>
+          </w:tcPr>
+          <w:p>
+            <w:pPr>
+              <w:spacing w:after="0" w:line="250"/>
+            </w:pPr>
+            <w:r>
+              <w:rPr>
+                <w:rFonts w:ascii="Consolas" w:cs="Consolas" w:eastAsia="Consolas" w:hAnsi="Consolas"/>
+                <w:b w:val="false"/>
+                <w:bCs w:val="false"/>
+                <w:color w:val="18313F"/>
+                <w:sz w:val="18"/>
+                <w:szCs w:val="18"/>
+              </w:rPr>
+              <w:t xml:space="preserve">campaignAnalytics.ts</w:t>
+            </w:r>
+          </w:p>
+        </w:tc>
+        <w:tc>
+          <w:tcPr>
+            <w:tcW w:type="dxa" w:w="2256"/>
+            <w:tcBorders>
+              <w:top w:val="single" w:color="C8D5DD" w:sz="4"/>
+              <w:left w:val="single" w:color="C8D5DD" w:sz="4"/>
+              <w:bottom w:val="single" w:color="C8D5DD" w:sz="4"/>
+              <w:right w:val="single" w:color="C8D5DD" w:sz="4"/>
+            </w:tcBorders>
+            <w:tcMar>
+              <w:top w:type="dxa" w:w="85"/>
+              <w:left w:type="dxa" w:w="100"/>
+              <w:bottom w:type="dxa" w:w="85"/>
+              <w:right w:type="dxa" w:w="100"/>
+            </w:tcMar>
+            <w:vAlign w:val="center"/>
+          </w:tcPr>
+          <w:p>
+            <w:pPr>
+              <w:spacing w:after="0" w:line="250"/>
+            </w:pPr>
+            <w:r>
+              <w:rPr>
+                <w:b w:val="false"/>
+                <w:bCs w:val="false"/>
+                <w:color w:val="18313F"/>
+                <w:sz w:val="18"/>
+                <w:szCs w:val="18"/>
+              </w:rPr>
+              <w:t xml:space="preserve">So sánh KPI và sinh Learning Package (F11/F12)</w:t>
+            </w:r>
+          </w:p>
+        </w:tc>
+        <w:tc>
+          <w:tcPr>
+            <w:tcW w:type="dxa" w:w="2256"/>
+            <w:tcBorders>
+              <w:top w:val="single" w:color="C8D5DD" w:sz="4"/>
+              <w:left w:val="single" w:color="C8D5DD" w:sz="4"/>
+              <w:bottom w:val="single" w:color="C8D5DD" w:sz="4"/>
+              <w:right w:val="single" w:color="C8D5DD" w:sz="4"/>
+            </w:tcBorders>
+            <w:tcMar>
+              <w:top w:type="dxa" w:w="85"/>
+              <w:left w:type="dxa" w:w="100"/>
+              <w:bottom w:type="dxa" w:w="85"/>
+              <w:right w:type="dxa" w:w="100"/>
+            </w:tcMar>
+            <w:vAlign w:val="center"/>
+          </w:tcPr>
+          <w:p>
+            <w:pPr>
+              <w:spacing w:after="0" w:line="250"/>
+            </w:pPr>
+            <w:r>
+              <w:rPr>
+                <w:rFonts w:ascii="Consolas" w:cs="Consolas" w:eastAsia="Consolas" w:hAnsi="Consolas"/>
+                <w:b w:val="false"/>
+                <w:bCs w:val="false"/>
+                <w:color w:val="18313F"/>
+                <w:sz w:val="18"/>
+                <w:szCs w:val="18"/>
+              </w:rPr>
+              <w:t xml:space="preserve">analyticsTypes.ts</w:t>
+            </w:r>
+          </w:p>
+        </w:tc>
+        <w:tc>
+          <w:tcPr>
+            <w:tcW w:type="dxa" w:w="2258"/>
+            <w:tcBorders>
+              <w:top w:val="single" w:color="C8D5DD" w:sz="4"/>
+              <w:left w:val="single" w:color="C8D5DD" w:sz="4"/>
+              <w:bottom w:val="single" w:color="C8D5DD" w:sz="4"/>
+              <w:right w:val="single" w:color="C8D5DD" w:sz="4"/>
+            </w:tcBorders>
+            <w:tcMar>
+              <w:top w:type="dxa" w:w="85"/>
+              <w:left w:type="dxa" w:w="100"/>
+              <w:bottom w:type="dxa" w:w="85"/>
+              <w:right w:type="dxa" w:w="100"/>
+            </w:tcMar>
+            <w:vAlign w:val="center"/>
+          </w:tcPr>
+          <w:p>
+            <w:pPr>
+              <w:spacing w:after="0" w:line="250"/>
+            </w:pPr>
+            <w:r>
+              <w:rPr>
+                <w:rFonts w:ascii="Consolas" w:cs="Consolas" w:eastAsia="Consolas" w:hAnsi="Consolas"/>
+                <w:b w:val="false"/>
+                <w:bCs w:val="false"/>
+                <w:color w:val="18313F"/>
+                <w:sz w:val="18"/>
+                <w:szCs w:val="18"/>
+              </w:rPr>
+              <w:t xml:space="preserve">GET /api/analytics</w:t>
+            </w:r>
+          </w:p>
+        </w:tc>
+      </w:tr>
+      <w:tr>
+        <w:trPr>
+          <w:cantSplit/>
+        </w:trPr>
+        <w:tc>
+          <w:tcPr>
+            <w:tcW w:type="dxa" w:w="2256"/>
+            <w:tcBorders>
+              <w:top w:val="single" w:color="C8D5DD" w:sz="4"/>
+              <w:left w:val="single" w:color="C8D5DD" w:sz="4"/>
+              <w:bottom w:val="single" w:color="C8D5DD" w:sz="4"/>
+              <w:right w:val="single" w:color="C8D5DD" w:sz="4"/>
+            </w:tcBorders>
+            <w:tcMar>
+              <w:top w:type="dxa" w:w="85"/>
+              <w:left w:type="dxa" w:w="100"/>
+              <w:bottom w:type="dxa" w:w="85"/>
+              <w:right w:type="dxa" w:w="100"/>
+            </w:tcMar>
+            <w:vAlign w:val="center"/>
+          </w:tcPr>
+          <w:p>
+            <w:pPr>
+              <w:spacing w:after="0" w:line="250"/>
+            </w:pPr>
+            <w:r>
+              <w:rPr>
+                <w:rFonts w:ascii="Consolas" w:cs="Consolas" w:eastAsia="Consolas" w:hAnsi="Consolas"/>
+                <w:b w:val="false"/>
+                <w:bCs w:val="false"/>
+                <w:color w:val="18313F"/>
+                <w:sz w:val="18"/>
+                <w:szCs w:val="18"/>
+              </w:rPr>
+              <w:t xml:space="preserve">communityInbox.ts</w:t>
+            </w:r>
+          </w:p>
+        </w:tc>
+        <w:tc>
+          <w:tcPr>
+            <w:tcW w:type="dxa" w:w="2256"/>
+            <w:tcBorders>
+              <w:top w:val="single" w:color="C8D5DD" w:sz="4"/>
+              <w:left w:val="single" w:color="C8D5DD" w:sz="4"/>
+              <w:bottom w:val="single" w:color="C8D5DD" w:sz="4"/>
+              <w:right w:val="single" w:color="C8D5DD" w:sz="4"/>
+            </w:tcBorders>
+            <w:tcMar>
+              <w:top w:type="dxa" w:w="85"/>
+              <w:left w:type="dxa" w:w="100"/>
+              <w:bottom w:type="dxa" w:w="85"/>
+              <w:right w:type="dxa" w:w="100"/>
+            </w:tcMar>
+            <w:vAlign w:val="center"/>
+          </w:tcPr>
+          <w:p>
+            <w:pPr>
+              <w:spacing w:after="0" w:line="250"/>
+            </w:pPr>
+            <w:r>
+              <w:rPr>
+                <w:b w:val="false"/>
+                <w:bCs w:val="false"/>
+                <w:color w:val="18313F"/>
+                <w:sz w:val="18"/>
+                <w:szCs w:val="18"/>
+              </w:rPr>
+              <w:t xml:space="preserve">Phân loại lead/FAQ/khiếu nại/spam, che PII (F10)</w:t>
+            </w:r>
+          </w:p>
+        </w:tc>
+        <w:tc>
+          <w:tcPr>
+            <w:tcW w:type="dxa" w:w="2256"/>
+            <w:tcBorders>
+              <w:top w:val="single" w:color="C8D5DD" w:sz="4"/>
+              <w:left w:val="single" w:color="C8D5DD" w:sz="4"/>
+              <w:bottom w:val="single" w:color="C8D5DD" w:sz="4"/>
+              <w:right w:val="single" w:color="C8D5DD" w:sz="4"/>
+            </w:tcBorders>
+            <w:tcMar>
+              <w:top w:type="dxa" w:w="85"/>
+              <w:left w:type="dxa" w:w="100"/>
+              <w:bottom w:type="dxa" w:w="85"/>
+              <w:right w:type="dxa" w:w="100"/>
+            </w:tcMar>
+            <w:vAlign w:val="center"/>
+          </w:tcPr>
+          <w:p>
+            <w:pPr>
+              <w:spacing w:after="0" w:line="250"/>
+            </w:pPr>
+            <w:r>
+              <w:rPr>
+                <w:rFonts w:ascii="Consolas" w:cs="Consolas" w:eastAsia="Consolas" w:hAnsi="Consolas"/>
+                <w:b w:val="false"/>
+                <w:bCs w:val="false"/>
+                <w:color w:val="18313F"/>
+                <w:sz w:val="18"/>
+                <w:szCs w:val="18"/>
+              </w:rPr>
+              <w:t xml:space="preserve">communityTypes.ts</w:t>
+            </w:r>
+          </w:p>
+        </w:tc>
+        <w:tc>
+          <w:tcPr>
+            <w:tcW w:type="dxa" w:w="2258"/>
+            <w:tcBorders>
+              <w:top w:val="single" w:color="C8D5DD" w:sz="4"/>
+              <w:left w:val="single" w:color="C8D5DD" w:sz="4"/>
+              <w:bottom w:val="single" w:color="C8D5DD" w:sz="4"/>
+              <w:right w:val="single" w:color="C8D5DD" w:sz="4"/>
+            </w:tcBorders>
+            <w:tcMar>
+              <w:top w:type="dxa" w:w="85"/>
+              <w:left w:type="dxa" w:w="100"/>
+              <w:bottom w:type="dxa" w:w="85"/>
+              <w:right w:type="dxa" w:w="100"/>
+            </w:tcMar>
+            <w:vAlign w:val="center"/>
+          </w:tcPr>
+          <w:p>
+            <w:pPr>
+              <w:spacing w:after="0" w:line="250"/>
+            </w:pPr>
+            <w:r>
+              <w:rPr>
+                <w:rFonts w:ascii="Consolas" w:cs="Consolas" w:eastAsia="Consolas" w:hAnsi="Consolas"/>
+                <w:b w:val="false"/>
+                <w:bCs w:val="false"/>
+                <w:color w:val="18313F"/>
+                <w:sz w:val="18"/>
+                <w:szCs w:val="18"/>
+              </w:rPr>
+              <w:t xml:space="preserve">GET /api/community</w:t>
+            </w:r>
+          </w:p>
+        </w:tc>
+      </w:tr>
+    </w:tbl>
+    <w:p>
+      <w:pPr>
+        <w:spacing w:after="160"/>
+      </w:pPr>
     </w:p>
     <w:p>
       <w:pPr>
@@ -5942,7 +6846,7 @@
       <w:r>
         <w:drawing>
           <wp:inline distT="0" distB="0" distL="0" distR="0">
-            <wp:extent cx="2295525" cy="6762750"/>
+            <wp:extent cx="5829300" cy="6762750"/>
             <wp:effectExtent t="0" r="0" b="0" l="0"/>
             <wp:docPr id="1" name="Hình 10. Sơ đồ hệ thống" descr="Hình 10. Sơ đồ hệ thống" title="Hình 10. Sơ đồ hệ thống"/>
             <wp:cNvGraphicFramePr>
@@ -5967,7 +6871,7 @@
                   <pic:spPr bwMode="auto">
                     <a:xfrm>
                       <a:off x="0" y="0"/>
-                      <a:ext cx="2295525" cy="6762750"/>
+                      <a:ext cx="5829300" cy="6762750"/>
                     </a:xfrm>
                     <a:prstGeom prst="rect">
                       <a:avLst/>
@@ -6763,6 +7667,630 @@
           </w:p>
         </w:tc>
       </w:tr>
+      <w:tr>
+        <w:trPr>
+          <w:cantSplit/>
+        </w:trPr>
+        <w:tc>
+          <w:tcPr>
+            <w:tcW w:type="dxa" w:w="3008"/>
+            <w:tcBorders>
+              <w:top w:val="single" w:color="C8D5DD" w:sz="4"/>
+              <w:left w:val="single" w:color="C8D5DD" w:sz="4"/>
+              <w:bottom w:val="single" w:color="C8D5DD" w:sz="4"/>
+              <w:right w:val="single" w:color="C8D5DD" w:sz="4"/>
+            </w:tcBorders>
+            <w:tcMar>
+              <w:top w:type="dxa" w:w="85"/>
+              <w:left w:type="dxa" w:w="100"/>
+              <w:bottom w:type="dxa" w:w="85"/>
+              <w:right w:type="dxa" w:w="100"/>
+            </w:tcMar>
+            <w:vAlign w:val="center"/>
+          </w:tcPr>
+          <w:p>
+            <w:pPr>
+              <w:spacing w:after="0" w:line="250"/>
+            </w:pPr>
+            <w:r>
+              <w:rPr>
+                <w:b w:val="false"/>
+                <w:bCs w:val="false"/>
+                <w:color w:val="18313F"/>
+                <w:sz w:val="18"/>
+                <w:szCs w:val="18"/>
+              </w:rPr>
+              <w:t xml:space="preserve">CompetitorChangeEvent</w:t>
+            </w:r>
+          </w:p>
+        </w:tc>
+        <w:tc>
+          <w:tcPr>
+            <w:tcW w:type="dxa" w:w="3008"/>
+            <w:tcBorders>
+              <w:top w:val="single" w:color="C8D5DD" w:sz="4"/>
+              <w:left w:val="single" w:color="C8D5DD" w:sz="4"/>
+              <w:bottom w:val="single" w:color="C8D5DD" w:sz="4"/>
+              <w:right w:val="single" w:color="C8D5DD" w:sz="4"/>
+            </w:tcBorders>
+            <w:tcMar>
+              <w:top w:type="dxa" w:w="85"/>
+              <w:left w:type="dxa" w:w="100"/>
+              <w:bottom w:type="dxa" w:w="85"/>
+              <w:right w:type="dxa" w:w="100"/>
+            </w:tcMar>
+            <w:vAlign w:val="center"/>
+          </w:tcPr>
+          <w:p>
+            <w:pPr>
+              <w:spacing w:after="0" w:line="250"/>
+            </w:pPr>
+            <w:r>
+              <w:rPr>
+                <w:b w:val="false"/>
+                <w:bCs w:val="false"/>
+                <w:color w:val="18313F"/>
+                <w:sz w:val="18"/>
+                <w:szCs w:val="18"/>
+              </w:rPr>
+              <w:t xml:space="preserve">id, dedupKey, competitorId, type, changeKind, impact, confidence, detectedAt</w:t>
+            </w:r>
+          </w:p>
+        </w:tc>
+        <w:tc>
+          <w:tcPr>
+            <w:tcW w:type="dxa" w:w="3010"/>
+            <w:tcBorders>
+              <w:top w:val="single" w:color="C8D5DD" w:sz="4"/>
+              <w:left w:val="single" w:color="C8D5DD" w:sz="4"/>
+              <w:bottom w:val="single" w:color="C8D5DD" w:sz="4"/>
+              <w:right w:val="single" w:color="C8D5DD" w:sz="4"/>
+            </w:tcBorders>
+            <w:tcMar>
+              <w:top w:type="dxa" w:w="85"/>
+              <w:left w:type="dxa" w:w="100"/>
+              <w:bottom w:type="dxa" w:w="85"/>
+              <w:right w:type="dxa" w:w="100"/>
+            </w:tcMar>
+            <w:vAlign w:val="center"/>
+          </w:tcPr>
+          <w:p>
+            <w:pPr>
+              <w:spacing w:after="0" w:line="250"/>
+            </w:pPr>
+            <w:r>
+              <w:rPr>
+                <w:b w:val="false"/>
+                <w:bCs w:val="false"/>
+                <w:color w:val="18313F"/>
+                <w:sz w:val="18"/>
+                <w:szCs w:val="18"/>
+              </w:rPr>
+              <w:t xml:space="preserve">Thay đổi đối thủ đã khử trùng (F03)</w:t>
+            </w:r>
+          </w:p>
+        </w:tc>
+      </w:tr>
+      <w:tr>
+        <w:trPr>
+          <w:cantSplit/>
+        </w:trPr>
+        <w:tc>
+          <w:tcPr>
+            <w:tcW w:type="dxa" w:w="3008"/>
+            <w:tcBorders>
+              <w:top w:val="single" w:color="C8D5DD" w:sz="4"/>
+              <w:left w:val="single" w:color="C8D5DD" w:sz="4"/>
+              <w:bottom w:val="single" w:color="C8D5DD" w:sz="4"/>
+              <w:right w:val="single" w:color="C8D5DD" w:sz="4"/>
+            </w:tcBorders>
+            <w:tcMar>
+              <w:top w:type="dxa" w:w="85"/>
+              <w:left w:type="dxa" w:w="100"/>
+              <w:bottom w:type="dxa" w:w="85"/>
+              <w:right w:type="dxa" w:w="100"/>
+            </w:tcMar>
+            <w:vAlign w:val="center"/>
+          </w:tcPr>
+          <w:p>
+            <w:pPr>
+              <w:spacing w:after="0" w:line="250"/>
+            </w:pPr>
+            <w:r>
+              <w:rPr>
+                <w:b w:val="false"/>
+                <w:bCs w:val="false"/>
+                <w:color w:val="18313F"/>
+                <w:sz w:val="18"/>
+                <w:szCs w:val="18"/>
+              </w:rPr>
+              <w:t xml:space="preserve">MarketInsight</w:t>
+            </w:r>
+          </w:p>
+        </w:tc>
+        <w:tc>
+          <w:tcPr>
+            <w:tcW w:type="dxa" w:w="3008"/>
+            <w:tcBorders>
+              <w:top w:val="single" w:color="C8D5DD" w:sz="4"/>
+              <w:left w:val="single" w:color="C8D5DD" w:sz="4"/>
+              <w:bottom w:val="single" w:color="C8D5DD" w:sz="4"/>
+              <w:right w:val="single" w:color="C8D5DD" w:sz="4"/>
+            </w:tcBorders>
+            <w:tcMar>
+              <w:top w:type="dxa" w:w="85"/>
+              <w:left w:type="dxa" w:w="100"/>
+              <w:bottom w:type="dxa" w:w="85"/>
+              <w:right w:type="dxa" w:w="100"/>
+            </w:tcMar>
+            <w:vAlign w:val="center"/>
+          </w:tcPr>
+          <w:p>
+            <w:pPr>
+              <w:spacing w:after="0" w:line="250"/>
+            </w:pPr>
+            <w:r>
+              <w:rPr>
+                <w:b w:val="false"/>
+                <w:bCs w:val="false"/>
+                <w:color w:val="18313F"/>
+                <w:sz w:val="18"/>
+                <w:szCs w:val="18"/>
+              </w:rPr>
+              <w:t xml:space="preserve">id, campaignId, category, statement, sourceType, confidence, score, mediaAngle</w:t>
+            </w:r>
+          </w:p>
+        </w:tc>
+        <w:tc>
+          <w:tcPr>
+            <w:tcW w:type="dxa" w:w="3010"/>
+            <w:tcBorders>
+              <w:top w:val="single" w:color="C8D5DD" w:sz="4"/>
+              <w:left w:val="single" w:color="C8D5DD" w:sz="4"/>
+              <w:bottom w:val="single" w:color="C8D5DD" w:sz="4"/>
+              <w:right w:val="single" w:color="C8D5DD" w:sz="4"/>
+            </w:tcBorders>
+            <w:tcMar>
+              <w:top w:type="dxa" w:w="85"/>
+              <w:left w:type="dxa" w:w="100"/>
+              <w:bottom w:type="dxa" w:w="85"/>
+              <w:right w:type="dxa" w:w="100"/>
+            </w:tcMar>
+            <w:vAlign w:val="center"/>
+          </w:tcPr>
+          <w:p>
+            <w:pPr>
+              <w:spacing w:after="0" w:line="250"/>
+            </w:pPr>
+            <w:r>
+              <w:rPr>
+                <w:b w:val="false"/>
+                <w:bCs w:val="false"/>
+                <w:color w:val="18313F"/>
+                <w:sz w:val="18"/>
+                <w:szCs w:val="18"/>
+              </w:rPr>
+              <w:t xml:space="preserve">Insight có nguồn và độ tin cậy (F02)</w:t>
+            </w:r>
+          </w:p>
+        </w:tc>
+      </w:tr>
+      <w:tr>
+        <w:trPr>
+          <w:cantSplit/>
+        </w:trPr>
+        <w:tc>
+          <w:tcPr>
+            <w:tcW w:type="dxa" w:w="3008"/>
+            <w:tcBorders>
+              <w:top w:val="single" w:color="C8D5DD" w:sz="4"/>
+              <w:left w:val="single" w:color="C8D5DD" w:sz="4"/>
+              <w:bottom w:val="single" w:color="C8D5DD" w:sz="4"/>
+              <w:right w:val="single" w:color="C8D5DD" w:sz="4"/>
+            </w:tcBorders>
+            <w:tcMar>
+              <w:top w:type="dxa" w:w="85"/>
+              <w:left w:type="dxa" w:w="100"/>
+              <w:bottom w:type="dxa" w:w="85"/>
+              <w:right w:type="dxa" w:w="100"/>
+            </w:tcMar>
+            <w:vAlign w:val="center"/>
+          </w:tcPr>
+          <w:p>
+            <w:pPr>
+              <w:spacing w:after="0" w:line="250"/>
+            </w:pPr>
+            <w:r>
+              <w:rPr>
+                <w:b w:val="false"/>
+                <w:bCs w:val="false"/>
+                <w:color w:val="18313F"/>
+                <w:sz w:val="18"/>
+                <w:szCs w:val="18"/>
+              </w:rPr>
+              <w:t xml:space="preserve">MediaAsset</w:t>
+            </w:r>
+          </w:p>
+        </w:tc>
+        <w:tc>
+          <w:tcPr>
+            <w:tcW w:type="dxa" w:w="3008"/>
+            <w:tcBorders>
+              <w:top w:val="single" w:color="C8D5DD" w:sz="4"/>
+              <w:left w:val="single" w:color="C8D5DD" w:sz="4"/>
+              <w:bottom w:val="single" w:color="C8D5DD" w:sz="4"/>
+              <w:right w:val="single" w:color="C8D5DD" w:sz="4"/>
+            </w:tcBorders>
+            <w:tcMar>
+              <w:top w:type="dxa" w:w="85"/>
+              <w:left w:type="dxa" w:w="100"/>
+              <w:bottom w:type="dxa" w:w="85"/>
+              <w:right w:type="dxa" w:w="100"/>
+            </w:tcMar>
+            <w:vAlign w:val="center"/>
+          </w:tcPr>
+          <w:p>
+            <w:pPr>
+              <w:spacing w:after="0" w:line="250"/>
+            </w:pPr>
+            <w:r>
+              <w:rPr>
+                <w:b w:val="false"/>
+                <w:bCs w:val="false"/>
+                <w:color w:val="18313F"/>
+                <w:sz w:val="18"/>
+                <w:szCs w:val="18"/>
+              </w:rPr>
+              <w:t xml:space="preserve">id, campaignId, type, status, provider, checksum, createdAt</w:t>
+            </w:r>
+          </w:p>
+        </w:tc>
+        <w:tc>
+          <w:tcPr>
+            <w:tcW w:type="dxa" w:w="3010"/>
+            <w:tcBorders>
+              <w:top w:val="single" w:color="C8D5DD" w:sz="4"/>
+              <w:left w:val="single" w:color="C8D5DD" w:sz="4"/>
+              <w:bottom w:val="single" w:color="C8D5DD" w:sz="4"/>
+              <w:right w:val="single" w:color="C8D5DD" w:sz="4"/>
+            </w:tcBorders>
+            <w:tcMar>
+              <w:top w:type="dxa" w:w="85"/>
+              <w:left w:type="dxa" w:w="100"/>
+              <w:bottom w:type="dxa" w:w="85"/>
+              <w:right w:type="dxa" w:w="100"/>
+            </w:tcMar>
+            <w:vAlign w:val="center"/>
+          </w:tcPr>
+          <w:p>
+            <w:pPr>
+              <w:spacing w:after="0" w:line="250"/>
+            </w:pPr>
+            <w:r>
+              <w:rPr>
+                <w:b w:val="false"/>
+                <w:bCs w:val="false"/>
+                <w:color w:val="18313F"/>
+                <w:sz w:val="18"/>
+                <w:szCs w:val="18"/>
+              </w:rPr>
+              <w:t xml:space="preserve">Asset video/storyboard/audio/subtitle theo hợp đồng (F06)</w:t>
+            </w:r>
+          </w:p>
+        </w:tc>
+      </w:tr>
+      <w:tr>
+        <w:trPr>
+          <w:cantSplit/>
+        </w:trPr>
+        <w:tc>
+          <w:tcPr>
+            <w:tcW w:type="dxa" w:w="3008"/>
+            <w:tcBorders>
+              <w:top w:val="single" w:color="C8D5DD" w:sz="4"/>
+              <w:left w:val="single" w:color="C8D5DD" w:sz="4"/>
+              <w:bottom w:val="single" w:color="C8D5DD" w:sz="4"/>
+              <w:right w:val="single" w:color="C8D5DD" w:sz="4"/>
+            </w:tcBorders>
+            <w:tcMar>
+              <w:top w:type="dxa" w:w="85"/>
+              <w:left w:type="dxa" w:w="100"/>
+              <w:bottom w:type="dxa" w:w="85"/>
+              <w:right w:type="dxa" w:w="100"/>
+            </w:tcMar>
+            <w:vAlign w:val="center"/>
+          </w:tcPr>
+          <w:p>
+            <w:pPr>
+              <w:spacing w:after="0" w:line="250"/>
+            </w:pPr>
+            <w:r>
+              <w:rPr>
+                <w:b w:val="false"/>
+                <w:bCs w:val="false"/>
+                <w:color w:val="18313F"/>
+                <w:sz w:val="18"/>
+                <w:szCs w:val="18"/>
+              </w:rPr>
+              <w:t xml:space="preserve">MetricSnapshot / KpiTarget</w:t>
+            </w:r>
+          </w:p>
+        </w:tc>
+        <w:tc>
+          <w:tcPr>
+            <w:tcW w:type="dxa" w:w="3008"/>
+            <w:tcBorders>
+              <w:top w:val="single" w:color="C8D5DD" w:sz="4"/>
+              <w:left w:val="single" w:color="C8D5DD" w:sz="4"/>
+              <w:bottom w:val="single" w:color="C8D5DD" w:sz="4"/>
+              <w:right w:val="single" w:color="C8D5DD" w:sz="4"/>
+            </w:tcBorders>
+            <w:tcMar>
+              <w:top w:type="dxa" w:w="85"/>
+              <w:left w:type="dxa" w:w="100"/>
+              <w:bottom w:type="dxa" w:w="85"/>
+              <w:right w:type="dxa" w:w="100"/>
+            </w:tcMar>
+            <w:vAlign w:val="center"/>
+          </w:tcPr>
+          <w:p>
+            <w:pPr>
+              <w:spacing w:after="0" w:line="250"/>
+            </w:pPr>
+            <w:r>
+              <w:rPr>
+                <w:b w:val="false"/>
+                <w:bCs w:val="false"/>
+                <w:color w:val="18313F"/>
+                <w:sz w:val="18"/>
+                <w:szCs w:val="18"/>
+              </w:rPr>
+              <w:t xml:space="preserve">campaignId, values, targets, capturedAt</w:t>
+            </w:r>
+          </w:p>
+        </w:tc>
+        <w:tc>
+          <w:tcPr>
+            <w:tcW w:type="dxa" w:w="3010"/>
+            <w:tcBorders>
+              <w:top w:val="single" w:color="C8D5DD" w:sz="4"/>
+              <w:left w:val="single" w:color="C8D5DD" w:sz="4"/>
+              <w:bottom w:val="single" w:color="C8D5DD" w:sz="4"/>
+              <w:right w:val="single" w:color="C8D5DD" w:sz="4"/>
+            </w:tcBorders>
+            <w:tcMar>
+              <w:top w:type="dxa" w:w="85"/>
+              <w:left w:type="dxa" w:w="100"/>
+              <w:bottom w:type="dxa" w:w="85"/>
+              <w:right w:type="dxa" w:w="100"/>
+            </w:tcMar>
+            <w:vAlign w:val="center"/>
+          </w:tcPr>
+          <w:p>
+            <w:pPr>
+              <w:spacing w:after="0" w:line="250"/>
+            </w:pPr>
+            <w:r>
+              <w:rPr>
+                <w:b w:val="false"/>
+                <w:bCs w:val="false"/>
+                <w:color w:val="18313F"/>
+                <w:sz w:val="18"/>
+                <w:szCs w:val="18"/>
+              </w:rPr>
+              <w:t xml:space="preserve">Chỉ số thực tế và mục tiêu KPI (F11)</w:t>
+            </w:r>
+          </w:p>
+        </w:tc>
+      </w:tr>
+      <w:tr>
+        <w:trPr>
+          <w:cantSplit/>
+        </w:trPr>
+        <w:tc>
+          <w:tcPr>
+            <w:tcW w:type="dxa" w:w="3008"/>
+            <w:tcBorders>
+              <w:top w:val="single" w:color="C8D5DD" w:sz="4"/>
+              <w:left w:val="single" w:color="C8D5DD" w:sz="4"/>
+              <w:bottom w:val="single" w:color="C8D5DD" w:sz="4"/>
+              <w:right w:val="single" w:color="C8D5DD" w:sz="4"/>
+            </w:tcBorders>
+            <w:tcMar>
+              <w:top w:type="dxa" w:w="85"/>
+              <w:left w:type="dxa" w:w="100"/>
+              <w:bottom w:type="dxa" w:w="85"/>
+              <w:right w:type="dxa" w:w="100"/>
+            </w:tcMar>
+            <w:vAlign w:val="center"/>
+          </w:tcPr>
+          <w:p>
+            <w:pPr>
+              <w:spacing w:after="0" w:line="250"/>
+            </w:pPr>
+            <w:r>
+              <w:rPr>
+                <w:b w:val="false"/>
+                <w:bCs w:val="false"/>
+                <w:color w:val="18313F"/>
+                <w:sz w:val="18"/>
+                <w:szCs w:val="18"/>
+              </w:rPr>
+              <w:t xml:space="preserve">LearningPackage</w:t>
+            </w:r>
+          </w:p>
+        </w:tc>
+        <w:tc>
+          <w:tcPr>
+            <w:tcW w:type="dxa" w:w="3008"/>
+            <w:tcBorders>
+              <w:top w:val="single" w:color="C8D5DD" w:sz="4"/>
+              <w:left w:val="single" w:color="C8D5DD" w:sz="4"/>
+              <w:bottom w:val="single" w:color="C8D5DD" w:sz="4"/>
+              <w:right w:val="single" w:color="C8D5DD" w:sz="4"/>
+            </w:tcBorders>
+            <w:tcMar>
+              <w:top w:type="dxa" w:w="85"/>
+              <w:left w:type="dxa" w:w="100"/>
+              <w:bottom w:type="dxa" w:w="85"/>
+              <w:right w:type="dxa" w:w="100"/>
+            </w:tcMar>
+            <w:vAlign w:val="center"/>
+          </w:tcPr>
+          <w:p>
+            <w:pPr>
+              <w:spacing w:after="0" w:line="250"/>
+            </w:pPr>
+            <w:r>
+              <w:rPr>
+                <w:b w:val="false"/>
+                <w:bCs w:val="false"/>
+                <w:color w:val="18313F"/>
+                <w:sz w:val="18"/>
+                <w:szCs w:val="18"/>
+              </w:rPr>
+              <w:t xml:space="preserve">campaignId, lessons, recommendedActions, nextCampaignHypothesis</w:t>
+            </w:r>
+          </w:p>
+        </w:tc>
+        <w:tc>
+          <w:tcPr>
+            <w:tcW w:type="dxa" w:w="3010"/>
+            <w:tcBorders>
+              <w:top w:val="single" w:color="C8D5DD" w:sz="4"/>
+              <w:left w:val="single" w:color="C8D5DD" w:sz="4"/>
+              <w:bottom w:val="single" w:color="C8D5DD" w:sz="4"/>
+              <w:right w:val="single" w:color="C8D5DD" w:sz="4"/>
+            </w:tcBorders>
+            <w:tcMar>
+              <w:top w:type="dxa" w:w="85"/>
+              <w:left w:type="dxa" w:w="100"/>
+              <w:bottom w:type="dxa" w:w="85"/>
+              <w:right w:type="dxa" w:w="100"/>
+            </w:tcMar>
+            <w:vAlign w:val="center"/>
+          </w:tcPr>
+          <w:p>
+            <w:pPr>
+              <w:spacing w:after="0" w:line="250"/>
+            </w:pPr>
+            <w:r>
+              <w:rPr>
+                <w:b w:val="false"/>
+                <w:bCs w:val="false"/>
+                <w:color w:val="18313F"/>
+                <w:sz w:val="18"/>
+                <w:szCs w:val="18"/>
+              </w:rPr>
+              <w:t xml:space="preserve">Bài học tự cải tiến (F12)</w:t>
+            </w:r>
+          </w:p>
+        </w:tc>
+      </w:tr>
+      <w:tr>
+        <w:trPr>
+          <w:cantSplit/>
+        </w:trPr>
+        <w:tc>
+          <w:tcPr>
+            <w:tcW w:type="dxa" w:w="3008"/>
+            <w:tcBorders>
+              <w:top w:val="single" w:color="C8D5DD" w:sz="4"/>
+              <w:left w:val="single" w:color="C8D5DD" w:sz="4"/>
+              <w:bottom w:val="single" w:color="C8D5DD" w:sz="4"/>
+              <w:right w:val="single" w:color="C8D5DD" w:sz="4"/>
+            </w:tcBorders>
+            <w:tcMar>
+              <w:top w:type="dxa" w:w="85"/>
+              <w:left w:type="dxa" w:w="100"/>
+              <w:bottom w:type="dxa" w:w="85"/>
+              <w:right w:type="dxa" w:w="100"/>
+            </w:tcMar>
+            <w:vAlign w:val="center"/>
+          </w:tcPr>
+          <w:p>
+            <w:pPr>
+              <w:spacing w:after="0" w:line="250"/>
+            </w:pPr>
+            <w:r>
+              <w:rPr>
+                <w:b w:val="false"/>
+                <w:bCs w:val="false"/>
+                <w:color w:val="18313F"/>
+                <w:sz w:val="18"/>
+                <w:szCs w:val="18"/>
+              </w:rPr>
+              <w:t xml:space="preserve">CommunityMessage</w:t>
+            </w:r>
+          </w:p>
+        </w:tc>
+        <w:tc>
+          <w:tcPr>
+            <w:tcW w:type="dxa" w:w="3008"/>
+            <w:tcBorders>
+              <w:top w:val="single" w:color="C8D5DD" w:sz="4"/>
+              <w:left w:val="single" w:color="C8D5DD" w:sz="4"/>
+              <w:bottom w:val="single" w:color="C8D5DD" w:sz="4"/>
+              <w:right w:val="single" w:color="C8D5DD" w:sz="4"/>
+            </w:tcBorders>
+            <w:tcMar>
+              <w:top w:type="dxa" w:w="85"/>
+              <w:left w:type="dxa" w:w="100"/>
+              <w:bottom w:type="dxa" w:w="85"/>
+              <w:right w:type="dxa" w:w="100"/>
+            </w:tcMar>
+            <w:vAlign w:val="center"/>
+          </w:tcPr>
+          <w:p>
+            <w:pPr>
+              <w:spacing w:after="0" w:line="250"/>
+            </w:pPr>
+            <w:r>
+              <w:rPr>
+                <w:b w:val="false"/>
+                <w:bCs w:val="false"/>
+                <w:color w:val="18313F"/>
+                <w:sz w:val="18"/>
+                <w:szCs w:val="18"/>
+              </w:rPr>
+              <w:t xml:space="preserve">id, channel, category, priority, leadScore, action</w:t>
+            </w:r>
+          </w:p>
+        </w:tc>
+        <w:tc>
+          <w:tcPr>
+            <w:tcW w:type="dxa" w:w="3010"/>
+            <w:tcBorders>
+              <w:top w:val="single" w:color="C8D5DD" w:sz="4"/>
+              <w:left w:val="single" w:color="C8D5DD" w:sz="4"/>
+              <w:bottom w:val="single" w:color="C8D5DD" w:sz="4"/>
+              <w:right w:val="single" w:color="C8D5DD" w:sz="4"/>
+            </w:tcBorders>
+            <w:tcMar>
+              <w:top w:type="dxa" w:w="85"/>
+              <w:left w:type="dxa" w:w="100"/>
+              <w:bottom w:type="dxa" w:w="85"/>
+              <w:right w:type="dxa" w:w="100"/>
+            </w:tcMar>
+            <w:vAlign w:val="center"/>
+          </w:tcPr>
+          <w:p>
+            <w:pPr>
+              <w:spacing w:after="0" w:line="250"/>
+            </w:pPr>
+            <w:r>
+              <w:rPr>
+                <w:b w:val="false"/>
+                <w:bCs w:val="false"/>
+                <w:color w:val="18313F"/>
+                <w:sz w:val="18"/>
+                <w:szCs w:val="18"/>
+              </w:rPr>
+              <w:t xml:space="preserve">Tương tác cộng đồng đã phân loại (F10)</w:t>
+            </w:r>
+          </w:p>
+        </w:tc>
+      </w:tr>
     </w:tbl>
     <w:p>
       <w:pPr>
@@ -6786,7 +8314,7 @@
       <w:r>
         <w:drawing>
           <wp:inline distT="0" distB="0" distL="0" distR="0">
-            <wp:extent cx="4000500" cy="6762750"/>
+            <wp:extent cx="6191250" cy="4400550"/>
             <wp:effectExtent t="0" r="0" b="0" l="0"/>
             <wp:docPr id="1" name="Hình 11. Sơ đồ hệ thống" descr="Hình 11. Sơ đồ hệ thống" title="Hình 11. Sơ đồ hệ thống"/>
             <wp:cNvGraphicFramePr>
@@ -6811,7 +8339,7 @@
                   <pic:spPr bwMode="auto">
                     <a:xfrm>
                       <a:off x="0" y="0"/>
-                      <a:ext cx="4000500" cy="6762750"/>
+                      <a:ext cx="6191250" cy="4400550"/>
                     </a:xfrm>
                     <a:prstGeom prst="rect">
                       <a:avLst/>
@@ -9682,6 +11210,26 @@
           <w:b/>
           <w:bCs/>
         </w:rPr>
+        <w:t xml:space="preserve">Module năng lực:</w:t>
+      </w:r>
+      <w:r>
+        <w:t xml:space="preserve"> competitor diff + dedup, market insight, video guard/fallback, KPI + learning, community triage + redact PII (F02/F03/F06/F10/F11).</w:t>
+      </w:r>
+    </w:p>
+    <w:p>
+      <w:pPr>
+        <w:pStyle w:val="ListParagraph"/>
+        <w:numPr>
+          <w:ilvl w:val="0"/>
+          <w:numId w:val="3"/>
+        </w:numPr>
+        <w:spacing w:after="80" w:line="300"/>
+      </w:pPr>
+      <w:r>
+        <w:rPr>
+          <w:b/>
+          <w:bCs/>
+        </w:rPr>
         <w:t xml:space="preserve">Golden sequence:</w:t>
       </w:r>
       <w:r>
@@ -9912,7 +11460,7 @@
                 <w:sz w:val="18"/>
                 <w:szCs w:val="18"/>
               </w:rPr>
-              <w:t xml:space="preserve">15 test files, 80/80 test passed</w:t>
+              <w:t xml:space="preserve">21 test files, 126/126 test passed</w:t>
             </w:r>
           </w:p>
         </w:tc>
@@ -10054,7 +11602,7 @@
                 <w:sz w:val="18"/>
                 <w:szCs w:val="18"/>
               </w:rPr>
-              <w:t xml:space="preserve">Passed, 1.582 modules transformed</w:t>
+              <w:t xml:space="preserve">Passed, 1.587 modules transformed</w:t>
             </w:r>
           </w:p>
         </w:tc>
@@ -13368,7 +14916,121 @@
           <w:sz w:val="18"/>
           <w:szCs w:val="18"/>
         </w:rPr>
-        <w:t xml:space="preserve">src/integrations/controlApi.ts           Read model và SSE</w:t>
+        <w:t xml:space="preserve">src/integrations/competitorMonitor.ts    Diff + dedup đối thủ (F03)</w:t>
+      </w:r>
+    </w:p>
+    <w:p>
+      <w:pPr>
+        <w:pBdr>
+          <w:left w:val="single" w:color="5C8BA5" w:sz="12" w:space="8"/>
+        </w:pBdr>
+        <w:shd w:fill="EEF3F6" w:val="clear"/>
+        <w:spacing w:after="0" w:line="260"/>
+        <w:ind w:left="240" w:right="120"/>
+      </w:pPr>
+      <w:r>
+        <w:rPr>
+          <w:rFonts w:ascii="Consolas" w:cs="Consolas" w:eastAsia="Consolas" w:hAnsi="Consolas"/>
+          <w:color w:val="223C49"/>
+          <w:sz w:val="18"/>
+          <w:szCs w:val="18"/>
+        </w:rPr>
+        <w:t xml:space="preserve">src/integrations/marketResearch.ts       Insight có nguồn/độ tin cậy (F02)</w:t>
+      </w:r>
+    </w:p>
+    <w:p>
+      <w:pPr>
+        <w:pBdr>
+          <w:left w:val="single" w:color="5C8BA5" w:sz="12" w:space="8"/>
+        </w:pBdr>
+        <w:shd w:fill="EEF3F6" w:val="clear"/>
+        <w:spacing w:after="0" w:line="260"/>
+        <w:ind w:left="240" w:right="120"/>
+      </w:pPr>
+      <w:r>
+        <w:rPr>
+          <w:rFonts w:ascii="Consolas" w:cs="Consolas" w:eastAsia="Consolas" w:hAnsi="Consolas"/>
+          <w:color w:val="223C49"/>
+          <w:sz w:val="18"/>
+          <w:szCs w:val="18"/>
+        </w:rPr>
+        <w:t xml:space="preserve">src/integrations/videoGenerationAdapter.ts  Guarded video job (F06)</w:t>
+      </w:r>
+    </w:p>
+    <w:p>
+      <w:pPr>
+        <w:pBdr>
+          <w:left w:val="single" w:color="5C8BA5" w:sz="12" w:space="8"/>
+        </w:pBdr>
+        <w:shd w:fill="EEF3F6" w:val="clear"/>
+        <w:spacing w:after="0" w:line="260"/>
+        <w:ind w:left="240" w:right="120"/>
+      </w:pPr>
+      <w:r>
+        <w:rPr>
+          <w:rFonts w:ascii="Consolas" w:cs="Consolas" w:eastAsia="Consolas" w:hAnsi="Consolas"/>
+          <w:color w:val="223C49"/>
+          <w:sz w:val="18"/>
+          <w:szCs w:val="18"/>
+        </w:rPr>
+        <w:t xml:space="preserve">src/integrations/campaignAnalytics.ts    KPI + Learning Package (F11/F12)</w:t>
+      </w:r>
+    </w:p>
+    <w:p>
+      <w:pPr>
+        <w:pBdr>
+          <w:left w:val="single" w:color="5C8BA5" w:sz="12" w:space="8"/>
+        </w:pBdr>
+        <w:shd w:fill="EEF3F6" w:val="clear"/>
+        <w:spacing w:after="0" w:line="260"/>
+        <w:ind w:left="240" w:right="120"/>
+      </w:pPr>
+      <w:r>
+        <w:rPr>
+          <w:rFonts w:ascii="Consolas" w:cs="Consolas" w:eastAsia="Consolas" w:hAnsi="Consolas"/>
+          <w:color w:val="223C49"/>
+          <w:sz w:val="18"/>
+          <w:szCs w:val="18"/>
+        </w:rPr>
+        <w:t xml:space="preserve">src/integrations/communityInbox.ts       Triage cộng đồng + redact PII (F10)</w:t>
+      </w:r>
+    </w:p>
+    <w:p>
+      <w:pPr>
+        <w:pBdr>
+          <w:left w:val="single" w:color="5C8BA5" w:sz="12" w:space="8"/>
+        </w:pBdr>
+        <w:shd w:fill="EEF3F6" w:val="clear"/>
+        <w:spacing w:after="0" w:line="260"/>
+        <w:ind w:left="240" w:right="120"/>
+      </w:pPr>
+      <w:r>
+        <w:rPr>
+          <w:rFonts w:ascii="Consolas" w:cs="Consolas" w:eastAsia="Consolas" w:hAnsi="Consolas"/>
+          <w:color w:val="223C49"/>
+          <w:sz w:val="18"/>
+          <w:szCs w:val="18"/>
+        </w:rPr>
+        <w:t xml:space="preserve">src/domain/*Types.ts                     Domain type + Zod schema</w:t>
+      </w:r>
+    </w:p>
+    <w:p>
+      <w:pPr>
+        <w:pBdr>
+          <w:left w:val="single" w:color="5C8BA5" w:sz="12" w:space="8"/>
+        </w:pBdr>
+        <w:shd w:fill="EEF3F6" w:val="clear"/>
+        <w:spacing w:after="0" w:line="260"/>
+        <w:ind w:left="240" w:right="120"/>
+      </w:pPr>
+      <w:r>
+        <w:rPr>
+          <w:rFonts w:ascii="Consolas" w:cs="Consolas" w:eastAsia="Consolas" w:hAnsi="Consolas"/>
+          <w:color w:val="223C49"/>
+          <w:sz w:val="18"/>
+          <w:szCs w:val="18"/>
+        </w:rPr>
+        <w:t xml:space="preserve">src/integrations/controlApi.ts           Read model và SSE (9 endpoint)</w:t>
       </w:r>
     </w:p>
     <w:p>
@@ -13406,7 +15068,7 @@
           <w:sz w:val="18"/>
           <w:szCs w:val="18"/>
         </w:rPr>
-        <w:t xml:space="preserve">tests/                                   Unit/integration/golden sequence</w:t>
+        <w:t xml:space="preserve">tests/                                   Unit/integration/golden sequence (126 test)</w:t>
       </w:r>
     </w:p>
     <w:p>

</xml_diff>

<commit_message>
docs(thesis): document the agent intelligence stack (section 9.2)
Add the 5-concern intelligence stack (models/knowledge/eval/observability/
memory) to the thesis design doc and regenerate the docx so the academic
artifact matches the code.

Co-Authored-By: Claude Opus 4.8 <noreply@anthropic.com>
</commit_message>
<xml_diff>
--- a/docs/AI_Agent_Marketing_Command_Center_Thesis_Design_2026.docx
+++ b/docs/AI_Agent_Marketing_Command_Center_Thesis_Design_2026.docx
@@ -6386,6 +6386,900 @@
     </w:p>
     <w:p>
       <w:pPr>
+        <w:pStyle w:val="Heading2"/>
+        <w:keepNext/>
+      </w:pPr>
+      <w:r>
+        <w:t xml:space="preserve">9.2. Agent Intelligence Stack (chuẩn ngành 2026)</w:t>
+      </w:r>
+    </w:p>
+    <w:p>
+      <w:pPr>
+        <w:spacing w:after="130" w:line="330"/>
+        <w:jc w:val="both"/>
+      </w:pPr>
+      <w:r>
+        <w:t xml:space="preserve">Hệ thống hiện thực đủ bảy mối quan tâm lõi của agent stack hiện đại. Ngoài Orchestration và Governance (đã trình bày ở các mục trước), năm năng lực trí tuệ được bổ sung:</w:t>
+      </w:r>
+    </w:p>
+    <w:tbl>
+      <w:tblPr>
+        <w:tblW w:type="dxa" w:w="9026"/>
+        <w:tblBorders>
+          <w:top w:val="single" w:color="auto" w:sz="4"/>
+          <w:left w:val="single" w:color="auto" w:sz="4"/>
+          <w:bottom w:val="single" w:color="auto" w:sz="4"/>
+          <w:right w:val="single" w:color="auto" w:sz="4"/>
+          <w:insideH w:val="single" w:color="auto" w:sz="4"/>
+          <w:insideV w:val="single" w:color="auto" w:sz="4"/>
+        </w:tblBorders>
+      </w:tblPr>
+      <w:tblGrid>
+        <w:gridCol w:w="2256"/>
+        <w:gridCol w:w="2256"/>
+        <w:gridCol w:w="2256"/>
+        <w:gridCol w:w="2258"/>
+      </w:tblGrid>
+      <w:tr>
+        <w:trPr>
+          <w:cantSplit/>
+        </w:trPr>
+        <w:tc>
+          <w:tcPr>
+            <w:tcW w:type="dxa" w:w="2256"/>
+            <w:tcBorders>
+              <w:top w:val="single" w:color="C8D5DD" w:sz="4"/>
+              <w:left w:val="single" w:color="C8D5DD" w:sz="4"/>
+              <w:bottom w:val="single" w:color="C8D5DD" w:sz="4"/>
+              <w:right w:val="single" w:color="C8D5DD" w:sz="4"/>
+            </w:tcBorders>
+            <w:shd w:fill="1F5D7A" w:val="clear"/>
+            <w:tcMar>
+              <w:top w:type="dxa" w:w="85"/>
+              <w:left w:type="dxa" w:w="100"/>
+              <w:bottom w:type="dxa" w:w="85"/>
+              <w:right w:type="dxa" w:w="100"/>
+            </w:tcMar>
+            <w:vAlign w:val="center"/>
+          </w:tcPr>
+          <w:p>
+            <w:pPr>
+              <w:spacing w:after="0" w:line="250"/>
+            </w:pPr>
+            <w:r>
+              <w:rPr>
+                <w:b/>
+                <w:bCs/>
+                <w:color w:val="FFFFFF"/>
+                <w:sz w:val="18"/>
+                <w:szCs w:val="18"/>
+              </w:rPr>
+              <w:t xml:space="preserve">Mối quan tâm</w:t>
+            </w:r>
+          </w:p>
+        </w:tc>
+        <w:tc>
+          <w:tcPr>
+            <w:tcW w:type="dxa" w:w="2256"/>
+            <w:tcBorders>
+              <w:top w:val="single" w:color="C8D5DD" w:sz="4"/>
+              <w:left w:val="single" w:color="C8D5DD" w:sz="4"/>
+              <w:bottom w:val="single" w:color="C8D5DD" w:sz="4"/>
+              <w:right w:val="single" w:color="C8D5DD" w:sz="4"/>
+            </w:tcBorders>
+            <w:shd w:fill="1F5D7A" w:val="clear"/>
+            <w:tcMar>
+              <w:top w:type="dxa" w:w="85"/>
+              <w:left w:type="dxa" w:w="100"/>
+              <w:bottom w:type="dxa" w:w="85"/>
+              <w:right w:type="dxa" w:w="100"/>
+            </w:tcMar>
+            <w:vAlign w:val="center"/>
+          </w:tcPr>
+          <w:p>
+            <w:pPr>
+              <w:spacing w:after="0" w:line="250"/>
+            </w:pPr>
+            <w:r>
+              <w:rPr>
+                <w:b/>
+                <w:bCs/>
+                <w:color w:val="FFFFFF"/>
+                <w:sz w:val="18"/>
+                <w:szCs w:val="18"/>
+              </w:rPr>
+              <w:t xml:space="preserve">Module</w:t>
+            </w:r>
+          </w:p>
+        </w:tc>
+        <w:tc>
+          <w:tcPr>
+            <w:tcW w:type="dxa" w:w="2256"/>
+            <w:tcBorders>
+              <w:top w:val="single" w:color="C8D5DD" w:sz="4"/>
+              <w:left w:val="single" w:color="C8D5DD" w:sz="4"/>
+              <w:bottom w:val="single" w:color="C8D5DD" w:sz="4"/>
+              <w:right w:val="single" w:color="C8D5DD" w:sz="4"/>
+            </w:tcBorders>
+            <w:shd w:fill="1F5D7A" w:val="clear"/>
+            <w:tcMar>
+              <w:top w:type="dxa" w:w="85"/>
+              <w:left w:type="dxa" w:w="100"/>
+              <w:bottom w:type="dxa" w:w="85"/>
+              <w:right w:type="dxa" w:w="100"/>
+            </w:tcMar>
+            <w:vAlign w:val="center"/>
+          </w:tcPr>
+          <w:p>
+            <w:pPr>
+              <w:spacing w:after="0" w:line="250"/>
+            </w:pPr>
+            <w:r>
+              <w:rPr>
+                <w:b/>
+                <w:bCs/>
+                <w:color w:val="FFFFFF"/>
+                <w:sz w:val="18"/>
+                <w:szCs w:val="18"/>
+              </w:rPr>
+              <w:t xml:space="preserve">Vai trò</w:t>
+            </w:r>
+          </w:p>
+        </w:tc>
+        <w:tc>
+          <w:tcPr>
+            <w:tcW w:type="dxa" w:w="2258"/>
+            <w:tcBorders>
+              <w:top w:val="single" w:color="C8D5DD" w:sz="4"/>
+              <w:left w:val="single" w:color="C8D5DD" w:sz="4"/>
+              <w:bottom w:val="single" w:color="C8D5DD" w:sz="4"/>
+              <w:right w:val="single" w:color="C8D5DD" w:sz="4"/>
+            </w:tcBorders>
+            <w:shd w:fill="1F5D7A" w:val="clear"/>
+            <w:tcMar>
+              <w:top w:type="dxa" w:w="85"/>
+              <w:left w:type="dxa" w:w="100"/>
+              <w:bottom w:type="dxa" w:w="85"/>
+              <w:right w:type="dxa" w:w="100"/>
+            </w:tcMar>
+            <w:vAlign w:val="center"/>
+          </w:tcPr>
+          <w:p>
+            <w:pPr>
+              <w:spacing w:after="0" w:line="250"/>
+            </w:pPr>
+            <w:r>
+              <w:rPr>
+                <w:b/>
+                <w:bCs/>
+                <w:color w:val="FFFFFF"/>
+                <w:sz w:val="18"/>
+                <w:szCs w:val="18"/>
+              </w:rPr>
+              <w:t xml:space="preserve">Endpoint</w:t>
+            </w:r>
+          </w:p>
+        </w:tc>
+      </w:tr>
+      <w:tr>
+        <w:trPr>
+          <w:cantSplit/>
+        </w:trPr>
+        <w:tc>
+          <w:tcPr>
+            <w:tcW w:type="dxa" w:w="2256"/>
+            <w:tcBorders>
+              <w:top w:val="single" w:color="C8D5DD" w:sz="4"/>
+              <w:left w:val="single" w:color="C8D5DD" w:sz="4"/>
+              <w:bottom w:val="single" w:color="C8D5DD" w:sz="4"/>
+              <w:right w:val="single" w:color="C8D5DD" w:sz="4"/>
+            </w:tcBorders>
+            <w:tcMar>
+              <w:top w:type="dxa" w:w="85"/>
+              <w:left w:type="dxa" w:w="100"/>
+              <w:bottom w:type="dxa" w:w="85"/>
+              <w:right w:type="dxa" w:w="100"/>
+            </w:tcMar>
+            <w:vAlign w:val="center"/>
+          </w:tcPr>
+          <w:p>
+            <w:pPr>
+              <w:spacing w:after="0" w:line="250"/>
+            </w:pPr>
+            <w:r>
+              <w:rPr>
+                <w:b w:val="false"/>
+                <w:bCs w:val="false"/>
+                <w:color w:val="18313F"/>
+                <w:sz w:val="18"/>
+                <w:szCs w:val="18"/>
+              </w:rPr>
+              <w:t xml:space="preserve">Models</w:t>
+            </w:r>
+          </w:p>
+        </w:tc>
+        <w:tc>
+          <w:tcPr>
+            <w:tcW w:type="dxa" w:w="2256"/>
+            <w:tcBorders>
+              <w:top w:val="single" w:color="C8D5DD" w:sz="4"/>
+              <w:left w:val="single" w:color="C8D5DD" w:sz="4"/>
+              <w:bottom w:val="single" w:color="C8D5DD" w:sz="4"/>
+              <w:right w:val="single" w:color="C8D5DD" w:sz="4"/>
+            </w:tcBorders>
+            <w:tcMar>
+              <w:top w:type="dxa" w:w="85"/>
+              <w:left w:type="dxa" w:w="100"/>
+              <w:bottom w:type="dxa" w:w="85"/>
+              <w:right w:type="dxa" w:w="100"/>
+            </w:tcMar>
+            <w:vAlign w:val="center"/>
+          </w:tcPr>
+          <w:p>
+            <w:pPr>
+              <w:spacing w:after="0" w:line="250"/>
+            </w:pPr>
+            <w:r>
+              <w:rPr>
+                <w:rFonts w:ascii="Consolas" w:cs="Consolas" w:eastAsia="Consolas" w:hAnsi="Consolas"/>
+                <w:b w:val="false"/>
+                <w:bCs w:val="false"/>
+                <w:color w:val="18313F"/>
+                <w:sz w:val="18"/>
+                <w:szCs w:val="18"/>
+              </w:rPr>
+              <w:t xml:space="preserve">modelRouter.ts</w:t>
+            </w:r>
+          </w:p>
+        </w:tc>
+        <w:tc>
+          <w:tcPr>
+            <w:tcW w:type="dxa" w:w="2256"/>
+            <w:tcBorders>
+              <w:top w:val="single" w:color="C8D5DD" w:sz="4"/>
+              <w:left w:val="single" w:color="C8D5DD" w:sz="4"/>
+              <w:bottom w:val="single" w:color="C8D5DD" w:sz="4"/>
+              <w:right w:val="single" w:color="C8D5DD" w:sz="4"/>
+            </w:tcBorders>
+            <w:tcMar>
+              <w:top w:type="dxa" w:w="85"/>
+              <w:left w:type="dxa" w:w="100"/>
+              <w:bottom w:type="dxa" w:w="85"/>
+              <w:right w:type="dxa" w:w="100"/>
+            </w:tcMar>
+            <w:vAlign w:val="center"/>
+          </w:tcPr>
+          <w:p>
+            <w:pPr>
+              <w:spacing w:after="0" w:line="250"/>
+            </w:pPr>
+            <w:r>
+              <w:rPr>
+                <w:b w:val="false"/>
+                <w:bCs w:val="false"/>
+                <w:color w:val="18313F"/>
+                <w:sz w:val="18"/>
+                <w:szCs w:val="18"/>
+              </w:rPr>
+              <w:t xml:space="preserve">Định tuyến model theo agent: việc khó (Manager, Brand) dùng tier mạnh, việc nhẹ dùng tier rẻ; kiểm soát chi phí</w:t>
+            </w:r>
+          </w:p>
+        </w:tc>
+        <w:tc>
+          <w:tcPr>
+            <w:tcW w:type="dxa" w:w="2258"/>
+            <w:tcBorders>
+              <w:top w:val="single" w:color="C8D5DD" w:sz="4"/>
+              <w:left w:val="single" w:color="C8D5DD" w:sz="4"/>
+              <w:bottom w:val="single" w:color="C8D5DD" w:sz="4"/>
+              <w:right w:val="single" w:color="C8D5DD" w:sz="4"/>
+            </w:tcBorders>
+            <w:tcMar>
+              <w:top w:type="dxa" w:w="85"/>
+              <w:left w:type="dxa" w:w="100"/>
+              <w:bottom w:type="dxa" w:w="85"/>
+              <w:right w:type="dxa" w:w="100"/>
+            </w:tcMar>
+            <w:vAlign w:val="center"/>
+          </w:tcPr>
+          <w:p>
+            <w:pPr>
+              <w:spacing w:after="0" w:line="250"/>
+            </w:pPr>
+            <w:r>
+              <w:rPr>
+                <w:b w:val="false"/>
+                <w:bCs w:val="false"/>
+                <w:color w:val="18313F"/>
+                <w:sz w:val="18"/>
+                <w:szCs w:val="18"/>
+              </w:rPr>
+              <w:t xml:space="preserve">—</w:t>
+            </w:r>
+          </w:p>
+        </w:tc>
+      </w:tr>
+      <w:tr>
+        <w:trPr>
+          <w:cantSplit/>
+        </w:trPr>
+        <w:tc>
+          <w:tcPr>
+            <w:tcW w:type="dxa" w:w="2256"/>
+            <w:tcBorders>
+              <w:top w:val="single" w:color="C8D5DD" w:sz="4"/>
+              <w:left w:val="single" w:color="C8D5DD" w:sz="4"/>
+              <w:bottom w:val="single" w:color="C8D5DD" w:sz="4"/>
+              <w:right w:val="single" w:color="C8D5DD" w:sz="4"/>
+            </w:tcBorders>
+            <w:tcMar>
+              <w:top w:type="dxa" w:w="85"/>
+              <w:left w:type="dxa" w:w="100"/>
+              <w:bottom w:type="dxa" w:w="85"/>
+              <w:right w:type="dxa" w:w="100"/>
+            </w:tcMar>
+            <w:vAlign w:val="center"/>
+          </w:tcPr>
+          <w:p>
+            <w:pPr>
+              <w:spacing w:after="0" w:line="250"/>
+            </w:pPr>
+            <w:r>
+              <w:rPr>
+                <w:b w:val="false"/>
+                <w:bCs w:val="false"/>
+                <w:color w:val="18313F"/>
+                <w:sz w:val="18"/>
+                <w:szCs w:val="18"/>
+              </w:rPr>
+              <w:t xml:space="preserve">Knowledge (RAG)</w:t>
+            </w:r>
+          </w:p>
+        </w:tc>
+        <w:tc>
+          <w:tcPr>
+            <w:tcW w:type="dxa" w:w="2256"/>
+            <w:tcBorders>
+              <w:top w:val="single" w:color="C8D5DD" w:sz="4"/>
+              <w:left w:val="single" w:color="C8D5DD" w:sz="4"/>
+              <w:bottom w:val="single" w:color="C8D5DD" w:sz="4"/>
+              <w:right w:val="single" w:color="C8D5DD" w:sz="4"/>
+            </w:tcBorders>
+            <w:tcMar>
+              <w:top w:type="dxa" w:w="85"/>
+              <w:left w:type="dxa" w:w="100"/>
+              <w:bottom w:type="dxa" w:w="85"/>
+              <w:right w:type="dxa" w:w="100"/>
+            </w:tcMar>
+            <w:vAlign w:val="center"/>
+          </w:tcPr>
+          <w:p>
+            <w:pPr>
+              <w:spacing w:after="0" w:line="250"/>
+            </w:pPr>
+            <w:r>
+              <w:rPr>
+                <w:rFonts w:ascii="Consolas" w:cs="Consolas" w:eastAsia="Consolas" w:hAnsi="Consolas"/>
+                <w:b w:val="false"/>
+                <w:bCs w:val="false"/>
+                <w:color w:val="18313F"/>
+                <w:sz w:val="18"/>
+                <w:szCs w:val="18"/>
+              </w:rPr>
+              <w:t xml:space="preserve">knowledgeBase.ts</w:t>
+            </w:r>
+          </w:p>
+        </w:tc>
+        <w:tc>
+          <w:tcPr>
+            <w:tcW w:type="dxa" w:w="2256"/>
+            <w:tcBorders>
+              <w:top w:val="single" w:color="C8D5DD" w:sz="4"/>
+              <w:left w:val="single" w:color="C8D5DD" w:sz="4"/>
+              <w:bottom w:val="single" w:color="C8D5DD" w:sz="4"/>
+              <w:right w:val="single" w:color="C8D5DD" w:sz="4"/>
+            </w:tcBorders>
+            <w:tcMar>
+              <w:top w:type="dxa" w:w="85"/>
+              <w:left w:type="dxa" w:w="100"/>
+              <w:bottom w:type="dxa" w:w="85"/>
+              <w:right w:type="dxa" w:w="100"/>
+            </w:tcMar>
+            <w:vAlign w:val="center"/>
+          </w:tcPr>
+          <w:p>
+            <w:pPr>
+              <w:spacing w:after="0" w:line="250"/>
+            </w:pPr>
+            <w:r>
+              <w:rPr>
+                <w:b w:val="false"/>
+                <w:bCs w:val="false"/>
+                <w:color w:val="18313F"/>
+                <w:sz w:val="18"/>
+                <w:szCs w:val="18"/>
+              </w:rPr>
+              <w:t xml:space="preserve">Retrieval từ vựng BM25-lite trên tri thức thương hiệu thật để agent bám dữ liệu, không bịa</w:t>
+            </w:r>
+          </w:p>
+        </w:tc>
+        <w:tc>
+          <w:tcPr>
+            <w:tcW w:type="dxa" w:w="2258"/>
+            <w:tcBorders>
+              <w:top w:val="single" w:color="C8D5DD" w:sz="4"/>
+              <w:left w:val="single" w:color="C8D5DD" w:sz="4"/>
+              <w:bottom w:val="single" w:color="C8D5DD" w:sz="4"/>
+              <w:right w:val="single" w:color="C8D5DD" w:sz="4"/>
+            </w:tcBorders>
+            <w:tcMar>
+              <w:top w:type="dxa" w:w="85"/>
+              <w:left w:type="dxa" w:w="100"/>
+              <w:bottom w:type="dxa" w:w="85"/>
+              <w:right w:type="dxa" w:w="100"/>
+            </w:tcMar>
+            <w:vAlign w:val="center"/>
+          </w:tcPr>
+          <w:p>
+            <w:pPr>
+              <w:spacing w:after="0" w:line="250"/>
+            </w:pPr>
+            <w:r>
+              <w:rPr>
+                <w:b w:val="false"/>
+                <w:bCs w:val="false"/>
+                <w:color w:val="18313F"/>
+                <w:sz w:val="18"/>
+                <w:szCs w:val="18"/>
+              </w:rPr>
+              <w:t xml:space="preserve">—</w:t>
+            </w:r>
+          </w:p>
+        </w:tc>
+      </w:tr>
+      <w:tr>
+        <w:trPr>
+          <w:cantSplit/>
+        </w:trPr>
+        <w:tc>
+          <w:tcPr>
+            <w:tcW w:type="dxa" w:w="2256"/>
+            <w:tcBorders>
+              <w:top w:val="single" w:color="C8D5DD" w:sz="4"/>
+              <w:left w:val="single" w:color="C8D5DD" w:sz="4"/>
+              <w:bottom w:val="single" w:color="C8D5DD" w:sz="4"/>
+              <w:right w:val="single" w:color="C8D5DD" w:sz="4"/>
+            </w:tcBorders>
+            <w:tcMar>
+              <w:top w:type="dxa" w:w="85"/>
+              <w:left w:type="dxa" w:w="100"/>
+              <w:bottom w:type="dxa" w:w="85"/>
+              <w:right w:type="dxa" w:w="100"/>
+            </w:tcMar>
+            <w:vAlign w:val="center"/>
+          </w:tcPr>
+          <w:p>
+            <w:pPr>
+              <w:spacing w:after="0" w:line="250"/>
+            </w:pPr>
+            <w:r>
+              <w:rPr>
+                <w:b w:val="false"/>
+                <w:bCs w:val="false"/>
+                <w:color w:val="18313F"/>
+                <w:sz w:val="18"/>
+                <w:szCs w:val="18"/>
+              </w:rPr>
+              <w:t xml:space="preserve">Eval</w:t>
+            </w:r>
+          </w:p>
+        </w:tc>
+        <w:tc>
+          <w:tcPr>
+            <w:tcW w:type="dxa" w:w="2256"/>
+            <w:tcBorders>
+              <w:top w:val="single" w:color="C8D5DD" w:sz="4"/>
+              <w:left w:val="single" w:color="C8D5DD" w:sz="4"/>
+              <w:bottom w:val="single" w:color="C8D5DD" w:sz="4"/>
+              <w:right w:val="single" w:color="C8D5DD" w:sz="4"/>
+            </w:tcBorders>
+            <w:tcMar>
+              <w:top w:type="dxa" w:w="85"/>
+              <w:left w:type="dxa" w:w="100"/>
+              <w:bottom w:type="dxa" w:w="85"/>
+              <w:right w:type="dxa" w:w="100"/>
+            </w:tcMar>
+            <w:vAlign w:val="center"/>
+          </w:tcPr>
+          <w:p>
+            <w:pPr>
+              <w:spacing w:after="0" w:line="250"/>
+            </w:pPr>
+            <w:r>
+              <w:rPr>
+                <w:rFonts w:ascii="Consolas" w:cs="Consolas" w:eastAsia="Consolas" w:hAnsi="Consolas"/>
+                <w:b w:val="false"/>
+                <w:bCs w:val="false"/>
+                <w:color w:val="18313F"/>
+                <w:sz w:val="18"/>
+                <w:szCs w:val="18"/>
+              </w:rPr>
+              <w:t xml:space="preserve">agentEval.ts</w:t>
+            </w:r>
+          </w:p>
+        </w:tc>
+        <w:tc>
+          <w:tcPr>
+            <w:tcW w:type="dxa" w:w="2256"/>
+            <w:tcBorders>
+              <w:top w:val="single" w:color="C8D5DD" w:sz="4"/>
+              <w:left w:val="single" w:color="C8D5DD" w:sz="4"/>
+              <w:bottom w:val="single" w:color="C8D5DD" w:sz="4"/>
+              <w:right w:val="single" w:color="C8D5DD" w:sz="4"/>
+            </w:tcBorders>
+            <w:tcMar>
+              <w:top w:type="dxa" w:w="85"/>
+              <w:left w:type="dxa" w:w="100"/>
+              <w:bottom w:type="dxa" w:w="85"/>
+              <w:right w:type="dxa" w:w="100"/>
+            </w:tcMar>
+            <w:vAlign w:val="center"/>
+          </w:tcPr>
+          <w:p>
+            <w:pPr>
+              <w:spacing w:after="0" w:line="250"/>
+            </w:pPr>
+            <w:r>
+              <w:rPr>
+                <w:b w:val="false"/>
+                <w:bCs w:val="false"/>
+                <w:color w:val="18313F"/>
+                <w:sz w:val="18"/>
+                <w:szCs w:val="18"/>
+              </w:rPr>
+              <w:t xml:space="preserve">Bộ chấm độc lập (LLM-as-judge + heuristic); chặn claim phóng đại; cap điểm hiệu dụng trước cổng duyệt</w:t>
+            </w:r>
+          </w:p>
+        </w:tc>
+        <w:tc>
+          <w:tcPr>
+            <w:tcW w:type="dxa" w:w="2258"/>
+            <w:tcBorders>
+              <w:top w:val="single" w:color="C8D5DD" w:sz="4"/>
+              <w:left w:val="single" w:color="C8D5DD" w:sz="4"/>
+              <w:bottom w:val="single" w:color="C8D5DD" w:sz="4"/>
+              <w:right w:val="single" w:color="C8D5DD" w:sz="4"/>
+            </w:tcBorders>
+            <w:tcMar>
+              <w:top w:type="dxa" w:w="85"/>
+              <w:left w:type="dxa" w:w="100"/>
+              <w:bottom w:type="dxa" w:w="85"/>
+              <w:right w:type="dxa" w:w="100"/>
+            </w:tcMar>
+            <w:vAlign w:val="center"/>
+          </w:tcPr>
+          <w:p>
+            <w:pPr>
+              <w:spacing w:after="0" w:line="250"/>
+            </w:pPr>
+            <w:r>
+              <w:rPr>
+                <w:b w:val="false"/>
+                <w:bCs w:val="false"/>
+                <w:color w:val="18313F"/>
+                <w:sz w:val="18"/>
+                <w:szCs w:val="18"/>
+              </w:rPr>
+              <w:t xml:space="preserve">—</w:t>
+            </w:r>
+          </w:p>
+        </w:tc>
+      </w:tr>
+      <w:tr>
+        <w:trPr>
+          <w:cantSplit/>
+        </w:trPr>
+        <w:tc>
+          <w:tcPr>
+            <w:tcW w:type="dxa" w:w="2256"/>
+            <w:tcBorders>
+              <w:top w:val="single" w:color="C8D5DD" w:sz="4"/>
+              <w:left w:val="single" w:color="C8D5DD" w:sz="4"/>
+              <w:bottom w:val="single" w:color="C8D5DD" w:sz="4"/>
+              <w:right w:val="single" w:color="C8D5DD" w:sz="4"/>
+            </w:tcBorders>
+            <w:tcMar>
+              <w:top w:type="dxa" w:w="85"/>
+              <w:left w:type="dxa" w:w="100"/>
+              <w:bottom w:type="dxa" w:w="85"/>
+              <w:right w:type="dxa" w:w="100"/>
+            </w:tcMar>
+            <w:vAlign w:val="center"/>
+          </w:tcPr>
+          <w:p>
+            <w:pPr>
+              <w:spacing w:after="0" w:line="250"/>
+            </w:pPr>
+            <w:r>
+              <w:rPr>
+                <w:b w:val="false"/>
+                <w:bCs w:val="false"/>
+                <w:color w:val="18313F"/>
+                <w:sz w:val="18"/>
+                <w:szCs w:val="18"/>
+              </w:rPr>
+              <w:t xml:space="preserve">Observability</w:t>
+            </w:r>
+          </w:p>
+        </w:tc>
+        <w:tc>
+          <w:tcPr>
+            <w:tcW w:type="dxa" w:w="2256"/>
+            <w:tcBorders>
+              <w:top w:val="single" w:color="C8D5DD" w:sz="4"/>
+              <w:left w:val="single" w:color="C8D5DD" w:sz="4"/>
+              <w:bottom w:val="single" w:color="C8D5DD" w:sz="4"/>
+              <w:right w:val="single" w:color="C8D5DD" w:sz="4"/>
+            </w:tcBorders>
+            <w:tcMar>
+              <w:top w:type="dxa" w:w="85"/>
+              <w:left w:type="dxa" w:w="100"/>
+              <w:bottom w:type="dxa" w:w="85"/>
+              <w:right w:type="dxa" w:w="100"/>
+            </w:tcMar>
+            <w:vAlign w:val="center"/>
+          </w:tcPr>
+          <w:p>
+            <w:pPr>
+              <w:spacing w:after="0" w:line="250"/>
+            </w:pPr>
+            <w:r>
+              <w:rPr>
+                <w:rFonts w:ascii="Consolas" w:cs="Consolas" w:eastAsia="Consolas" w:hAnsi="Consolas"/>
+                <w:b w:val="false"/>
+                <w:bCs w:val="false"/>
+                <w:color w:val="18313F"/>
+                <w:sz w:val="18"/>
+                <w:szCs w:val="18"/>
+              </w:rPr>
+              <w:t xml:space="preserve">telemetry.ts</w:t>
+            </w:r>
+          </w:p>
+        </w:tc>
+        <w:tc>
+          <w:tcPr>
+            <w:tcW w:type="dxa" w:w="2256"/>
+            <w:tcBorders>
+              <w:top w:val="single" w:color="C8D5DD" w:sz="4"/>
+              <w:left w:val="single" w:color="C8D5DD" w:sz="4"/>
+              <w:bottom w:val="single" w:color="C8D5DD" w:sz="4"/>
+              <w:right w:val="single" w:color="C8D5DD" w:sz="4"/>
+            </w:tcBorders>
+            <w:tcMar>
+              <w:top w:type="dxa" w:w="85"/>
+              <w:left w:type="dxa" w:w="100"/>
+              <w:bottom w:type="dxa" w:w="85"/>
+              <w:right w:type="dxa" w:w="100"/>
+            </w:tcMar>
+            <w:vAlign w:val="center"/>
+          </w:tcPr>
+          <w:p>
+            <w:pPr>
+              <w:spacing w:after="0" w:line="250"/>
+            </w:pPr>
+            <w:r>
+              <w:rPr>
+                <w:b w:val="false"/>
+                <w:bCs w:val="false"/>
+                <w:color w:val="18313F"/>
+                <w:sz w:val="18"/>
+                <w:szCs w:val="18"/>
+              </w:rPr>
+              <w:t xml:space="preserve">Span mỗi lượt agent: model, token/chi phí ước lượng, điểm eval, drift</w:t>
+            </w:r>
+          </w:p>
+        </w:tc>
+        <w:tc>
+          <w:tcPr>
+            <w:tcW w:type="dxa" w:w="2258"/>
+            <w:tcBorders>
+              <w:top w:val="single" w:color="C8D5DD" w:sz="4"/>
+              <w:left w:val="single" w:color="C8D5DD" w:sz="4"/>
+              <w:bottom w:val="single" w:color="C8D5DD" w:sz="4"/>
+              <w:right w:val="single" w:color="C8D5DD" w:sz="4"/>
+            </w:tcBorders>
+            <w:tcMar>
+              <w:top w:type="dxa" w:w="85"/>
+              <w:left w:type="dxa" w:w="100"/>
+              <w:bottom w:type="dxa" w:w="85"/>
+              <w:right w:type="dxa" w:w="100"/>
+            </w:tcMar>
+            <w:vAlign w:val="center"/>
+          </w:tcPr>
+          <w:p>
+            <w:pPr>
+              <w:spacing w:after="0" w:line="250"/>
+            </w:pPr>
+            <w:r>
+              <w:rPr>
+                <w:rFonts w:ascii="Consolas" w:cs="Consolas" w:eastAsia="Consolas" w:hAnsi="Consolas"/>
+                <w:b w:val="false"/>
+                <w:bCs w:val="false"/>
+                <w:color w:val="18313F"/>
+                <w:sz w:val="18"/>
+                <w:szCs w:val="18"/>
+              </w:rPr>
+              <w:t xml:space="preserve">GET /api/telemetry</w:t>
+            </w:r>
+          </w:p>
+        </w:tc>
+      </w:tr>
+      <w:tr>
+        <w:trPr>
+          <w:cantSplit/>
+        </w:trPr>
+        <w:tc>
+          <w:tcPr>
+            <w:tcW w:type="dxa" w:w="2256"/>
+            <w:tcBorders>
+              <w:top w:val="single" w:color="C8D5DD" w:sz="4"/>
+              <w:left w:val="single" w:color="C8D5DD" w:sz="4"/>
+              <w:bottom w:val="single" w:color="C8D5DD" w:sz="4"/>
+              <w:right w:val="single" w:color="C8D5DD" w:sz="4"/>
+            </w:tcBorders>
+            <w:tcMar>
+              <w:top w:type="dxa" w:w="85"/>
+              <w:left w:type="dxa" w:w="100"/>
+              <w:bottom w:type="dxa" w:w="85"/>
+              <w:right w:type="dxa" w:w="100"/>
+            </w:tcMar>
+            <w:vAlign w:val="center"/>
+          </w:tcPr>
+          <w:p>
+            <w:pPr>
+              <w:spacing w:after="0" w:line="250"/>
+            </w:pPr>
+            <w:r>
+              <w:rPr>
+                <w:b w:val="false"/>
+                <w:bCs w:val="false"/>
+                <w:color w:val="18313F"/>
+                <w:sz w:val="18"/>
+                <w:szCs w:val="18"/>
+              </w:rPr>
+              <w:t xml:space="preserve">Memory</w:t>
+            </w:r>
+          </w:p>
+        </w:tc>
+        <w:tc>
+          <w:tcPr>
+            <w:tcW w:type="dxa" w:w="2256"/>
+            <w:tcBorders>
+              <w:top w:val="single" w:color="C8D5DD" w:sz="4"/>
+              <w:left w:val="single" w:color="C8D5DD" w:sz="4"/>
+              <w:bottom w:val="single" w:color="C8D5DD" w:sz="4"/>
+              <w:right w:val="single" w:color="C8D5DD" w:sz="4"/>
+            </w:tcBorders>
+            <w:tcMar>
+              <w:top w:type="dxa" w:w="85"/>
+              <w:left w:type="dxa" w:w="100"/>
+              <w:bottom w:type="dxa" w:w="85"/>
+              <w:right w:type="dxa" w:w="100"/>
+            </w:tcMar>
+            <w:vAlign w:val="center"/>
+          </w:tcPr>
+          <w:p>
+            <w:pPr>
+              <w:spacing w:after="0" w:line="250"/>
+            </w:pPr>
+            <w:r>
+              <w:rPr>
+                <w:rFonts w:ascii="Consolas" w:cs="Consolas" w:eastAsia="Consolas" w:hAnsi="Consolas"/>
+                <w:b w:val="false"/>
+                <w:bCs w:val="false"/>
+                <w:color w:val="18313F"/>
+                <w:sz w:val="18"/>
+                <w:szCs w:val="18"/>
+              </w:rPr>
+              <w:t xml:space="preserve">campaignMemory.ts</w:t>
+            </w:r>
+          </w:p>
+        </w:tc>
+        <w:tc>
+          <w:tcPr>
+            <w:tcW w:type="dxa" w:w="2256"/>
+            <w:tcBorders>
+              <w:top w:val="single" w:color="C8D5DD" w:sz="4"/>
+              <w:left w:val="single" w:color="C8D5DD" w:sz="4"/>
+              <w:bottom w:val="single" w:color="C8D5DD" w:sz="4"/>
+              <w:right w:val="single" w:color="C8D5DD" w:sz="4"/>
+            </w:tcBorders>
+            <w:tcMar>
+              <w:top w:type="dxa" w:w="85"/>
+              <w:left w:type="dxa" w:w="100"/>
+              <w:bottom w:type="dxa" w:w="85"/>
+              <w:right w:type="dxa" w:w="100"/>
+            </w:tcMar>
+            <w:vAlign w:val="center"/>
+          </w:tcPr>
+          <w:p>
+            <w:pPr>
+              <w:spacing w:after="0" w:line="250"/>
+            </w:pPr>
+            <w:r>
+              <w:rPr>
+                <w:b w:val="false"/>
+                <w:bCs w:val="false"/>
+                <w:color w:val="18313F"/>
+                <w:sz w:val="18"/>
+                <w:szCs w:val="18"/>
+              </w:rPr>
+              <w:t xml:space="preserve">Ký ức dài hạn: chiến dịch đã đo lường trở thành bài học cho chiến dịch sau (nối Learning Package F12)</w:t>
+            </w:r>
+          </w:p>
+        </w:tc>
+        <w:tc>
+          <w:tcPr>
+            <w:tcW w:type="dxa" w:w="2258"/>
+            <w:tcBorders>
+              <w:top w:val="single" w:color="C8D5DD" w:sz="4"/>
+              <w:left w:val="single" w:color="C8D5DD" w:sz="4"/>
+              <w:bottom w:val="single" w:color="C8D5DD" w:sz="4"/>
+              <w:right w:val="single" w:color="C8D5DD" w:sz="4"/>
+            </w:tcBorders>
+            <w:tcMar>
+              <w:top w:type="dxa" w:w="85"/>
+              <w:left w:type="dxa" w:w="100"/>
+              <w:bottom w:type="dxa" w:w="85"/>
+              <w:right w:type="dxa" w:w="100"/>
+            </w:tcMar>
+            <w:vAlign w:val="center"/>
+          </w:tcPr>
+          <w:p>
+            <w:pPr>
+              <w:spacing w:after="0" w:line="250"/>
+            </w:pPr>
+            <w:r>
+              <w:rPr>
+                <w:rFonts w:ascii="Consolas" w:cs="Consolas" w:eastAsia="Consolas" w:hAnsi="Consolas"/>
+                <w:b w:val="false"/>
+                <w:bCs w:val="false"/>
+                <w:color w:val="18313F"/>
+                <w:sz w:val="18"/>
+                <w:szCs w:val="18"/>
+              </w:rPr>
+              <w:t xml:space="preserve">GET /api/memory</w:t>
+            </w:r>
+          </w:p>
+        </w:tc>
+      </w:tr>
+    </w:tbl>
+    <w:p>
+      <w:pPr>
+        <w:spacing w:after="160"/>
+      </w:pPr>
+    </w:p>
+    <w:p>
+      <w:pPr>
+        <w:spacing w:after="130" w:line="330"/>
+        <w:jc w:val="both"/>
+      </w:pPr>
+      <w:r>
+        <w:t xml:space="preserve">Tất cả chạy chế độ mock/heuristic khi chưa có API key và tự bật chế độ thật khi cắm </w:t>
+      </w:r>
+      <w:r>
+        <w:rPr>
+          <w:rFonts w:ascii="Consolas" w:cs="Consolas" w:eastAsia="Consolas" w:hAnsi="Consolas"/>
+          <w:color w:val="24566E"/>
+        </w:rPr>
+        <w:t xml:space="preserve">NINE_ROUTER_API_KEY</w:t>
+      </w:r>
+      <w:r>
+        <w:t xml:space="preserve">, không phải sửa mã.</w:t>
+      </w:r>
+    </w:p>
+    <w:p>
+      <w:pPr>
         <w:pStyle w:val="Heading1"/>
         <w:keepNext/>
       </w:pPr>
@@ -14307,7 +15201,7 @@
           <w:sz w:val="18"/>
           <w:szCs w:val="18"/>
         </w:rPr>
-        <w:t xml:space="preserve">npm run dev -- --port 5174</w:t>
+        <w:t xml:space="preserve">npm run dev</w:t>
       </w:r>
     </w:p>
     <w:p>
@@ -14327,6 +15221,25 @@
           <w:szCs w:val="18"/>
         </w:rPr>
         <w:t xml:space="preserve">npm run control:api</w:t>
+      </w:r>
+    </w:p>
+    <w:p>
+      <w:pPr>
+        <w:pBdr>
+          <w:left w:val="single" w:color="5C8BA5" w:sz="12" w:space="8"/>
+        </w:pBdr>
+        <w:shd w:fill="EEF3F6" w:val="clear"/>
+        <w:spacing w:after="0" w:line="260"/>
+        <w:ind w:left="240" w:right="120"/>
+      </w:pPr>
+      <w:r>
+        <w:rPr>
+          <w:rFonts w:ascii="Consolas" w:cs="Consolas" w:eastAsia="Consolas" w:hAnsi="Consolas"/>
+          <w:color w:val="223C49"/>
+          <w:sz w:val="18"/>
+          <w:szCs w:val="18"/>
+        </w:rPr>
+        <w:t xml:space="preserve">npm run demo:golden</w:t>
       </w:r>
     </w:p>
     <w:p>

</xml_diff>